<commit_message>
Ajustes presentación datos facturación con cancelaciones
</commit_message>
<xml_diff>
--- a/Documentación/Brechas/Criterios de Aceptacion - V3.docx
+++ b/Documentación/Brechas/Criterios de Aceptacion - V3.docx
@@ -1170,17 +1170,11 @@
             </w:tcMar>
           </w:tcPr>
           <w:p>
-            <w:pPr>
-              <w:rPr>
-                <w:strike/>
-              </w:rPr>
-            </w:pPr>
-            <w:r>
-              <w:rPr>
-                <w:rFonts w:ascii="Calibri" w:eastAsia="Calibri" w:hAnsi="Calibri" w:cs="Calibri"/>
-                <w:b/>
-                <w:bCs/>
-                <w:strike/>
+            <w:r>
+              <w:rPr>
+                <w:rFonts w:ascii="Calibri" w:eastAsia="Calibri" w:hAnsi="Calibri" w:cs="Calibri"/>
+                <w:b/>
+                <w:bCs/>
                 <w:color w:val="0A5C9E"/>
                 <w:sz w:val="16"/>
                 <w:szCs w:val="16"/>
@@ -1209,9 +1203,6 @@
           <w:p>
             <w:pPr>
               <w:jc w:val="center"/>
-              <w:rPr>
-                <w:strike/>
-              </w:rPr>
             </w:pPr>
             <w:proofErr w:type="spellStart"/>
             <w:r>
@@ -1219,7 +1210,6 @@
                 <w:rFonts w:ascii="Calibri" w:eastAsia="Calibri" w:hAnsi="Calibri" w:cs="Calibri"/>
                 <w:b/>
                 <w:bCs/>
-                <w:strike/>
                 <w:color w:val="D35400"/>
                 <w:sz w:val="15"/>
                 <w:szCs w:val="15"/>
@@ -1249,16 +1239,14 @@
           <w:p>
             <w:pPr>
               <w:rPr>
-                <w:strike/>
-                <w:lang w:val="es-NI"/>
-              </w:rPr>
-            </w:pPr>
-            <w:r>
-              <w:rPr>
-                <w:rFonts w:ascii="Calibri" w:eastAsia="Calibri" w:hAnsi="Calibri" w:cs="Calibri"/>
-                <w:b/>
-                <w:bCs/>
-                <w:strike/>
+                <w:lang w:val="es-NI"/>
+              </w:rPr>
+            </w:pPr>
+            <w:r>
+              <w:rPr>
+                <w:rFonts w:ascii="Calibri" w:eastAsia="Calibri" w:hAnsi="Calibri" w:cs="Calibri"/>
+                <w:b/>
+                <w:bCs/>
                 <w:color w:val="1B2B4B"/>
                 <w:sz w:val="17"/>
                 <w:szCs w:val="17"/>
@@ -1288,14 +1276,12 @@
           <w:p>
             <w:pPr>
               <w:rPr>
-                <w:strike/>
-                <w:lang w:val="es-NI"/>
-              </w:rPr>
-            </w:pPr>
-            <w:r>
-              <w:rPr>
-                <w:rFonts w:ascii="Calibri" w:eastAsia="Calibri" w:hAnsi="Calibri" w:cs="Calibri"/>
-                <w:strike/>
+                <w:lang w:val="es-NI"/>
+              </w:rPr>
+            </w:pPr>
+            <w:r>
+              <w:rPr>
+                <w:rFonts w:ascii="Calibri" w:eastAsia="Calibri" w:hAnsi="Calibri" w:cs="Calibri"/>
                 <w:color w:val="1A1A2E"/>
                 <w:sz w:val="17"/>
                 <w:szCs w:val="17"/>
@@ -1327,7 +1313,6 @@
           <w:p>
             <w:pPr>
               <w:rPr>
-                <w:strike/>
                 <w:lang w:val="es-NI"/>
               </w:rPr>
             </w:pPr>
@@ -1353,7 +1338,6 @@
           <w:p>
             <w:pPr>
               <w:rPr>
-                <w:strike/>
                 <w:lang w:val="es-NI"/>
               </w:rPr>
             </w:pPr>
@@ -1379,7 +1363,6 @@
           <w:p>
             <w:pPr>
               <w:rPr>
-                <w:strike/>
                 <w:lang w:val="es-NI"/>
               </w:rPr>
             </w:pPr>
@@ -1405,16 +1388,14 @@
           <w:p>
             <w:pPr>
               <w:rPr>
-                <w:strike/>
-                <w:lang w:val="es-NI"/>
-              </w:rPr>
-            </w:pPr>
-            <w:r>
-              <w:rPr>
-                <w:rFonts w:ascii="Calibri" w:eastAsia="Calibri" w:hAnsi="Calibri" w:cs="Calibri"/>
-                <w:b/>
-                <w:bCs/>
-                <w:strike/>
+                <w:lang w:val="es-NI"/>
+              </w:rPr>
+            </w:pPr>
+            <w:r>
+              <w:rPr>
+                <w:rFonts w:ascii="Calibri" w:eastAsia="Calibri" w:hAnsi="Calibri" w:cs="Calibri"/>
+                <w:b/>
+                <w:bCs/>
                 <w:color w:val="0E7FD4"/>
                 <w:sz w:val="17"/>
                 <w:szCs w:val="17"/>
@@ -1425,7 +1406,6 @@
             <w:r>
               <w:rPr>
                 <w:rFonts w:ascii="Calibri" w:eastAsia="Calibri" w:hAnsi="Calibri" w:cs="Calibri"/>
-                <w:strike/>
                 <w:color w:val="1A1A2E"/>
                 <w:sz w:val="17"/>
                 <w:szCs w:val="17"/>
@@ -1457,7 +1437,6 @@
           <w:p>
             <w:pPr>
               <w:rPr>
-                <w:strike/>
                 <w:lang w:val="es-NI"/>
               </w:rPr>
             </w:pPr>
@@ -1483,7 +1462,6 @@
           <w:p>
             <w:pPr>
               <w:rPr>
-                <w:strike/>
                 <w:lang w:val="es-NI"/>
               </w:rPr>
             </w:pPr>
@@ -1509,7 +1487,6 @@
           <w:p>
             <w:pPr>
               <w:rPr>
-                <w:strike/>
                 <w:lang w:val="es-NI"/>
               </w:rPr>
             </w:pPr>
@@ -1535,16 +1512,14 @@
           <w:p>
             <w:pPr>
               <w:rPr>
-                <w:strike/>
-                <w:lang w:val="es-NI"/>
-              </w:rPr>
-            </w:pPr>
-            <w:r>
-              <w:rPr>
-                <w:rFonts w:ascii="Calibri" w:eastAsia="Calibri" w:hAnsi="Calibri" w:cs="Calibri"/>
-                <w:b/>
-                <w:bCs/>
-                <w:strike/>
+                <w:lang w:val="es-NI"/>
+              </w:rPr>
+            </w:pPr>
+            <w:r>
+              <w:rPr>
+                <w:rFonts w:ascii="Calibri" w:eastAsia="Calibri" w:hAnsi="Calibri" w:cs="Calibri"/>
+                <w:b/>
+                <w:bCs/>
                 <w:color w:val="0E7FD4"/>
                 <w:sz w:val="17"/>
                 <w:szCs w:val="17"/>
@@ -1555,7 +1530,6 @@
             <w:r>
               <w:rPr>
                 <w:rFonts w:ascii="Calibri" w:eastAsia="Calibri" w:hAnsi="Calibri" w:cs="Calibri"/>
-                <w:strike/>
                 <w:color w:val="1A1A2E"/>
                 <w:sz w:val="17"/>
                 <w:szCs w:val="17"/>
@@ -1582,7 +1556,6 @@
           <w:p>
             <w:pPr>
               <w:rPr>
-                <w:strike/>
                 <w:lang w:val="es-NI"/>
               </w:rPr>
             </w:pPr>
@@ -1608,17 +1581,11 @@
             </w:tcMar>
           </w:tcPr>
           <w:p>
-            <w:pPr>
-              <w:rPr>
-                <w:strike/>
-              </w:rPr>
-            </w:pPr>
-            <w:r>
-              <w:rPr>
-                <w:rFonts w:ascii="Calibri" w:eastAsia="Calibri" w:hAnsi="Calibri" w:cs="Calibri"/>
-                <w:b/>
-                <w:bCs/>
-                <w:strike/>
+            <w:r>
+              <w:rPr>
+                <w:rFonts w:ascii="Calibri" w:eastAsia="Calibri" w:hAnsi="Calibri" w:cs="Calibri"/>
+                <w:b/>
+                <w:bCs/>
                 <w:color w:val="0A5C9E"/>
                 <w:sz w:val="16"/>
                 <w:szCs w:val="16"/>
@@ -1647,16 +1614,12 @@
           <w:p>
             <w:pPr>
               <w:jc w:val="center"/>
-              <w:rPr>
-                <w:strike/>
-              </w:rPr>
-            </w:pPr>
-            <w:r>
-              <w:rPr>
-                <w:rFonts w:ascii="Calibri" w:eastAsia="Calibri" w:hAnsi="Calibri" w:cs="Calibri"/>
-                <w:b/>
-                <w:bCs/>
-                <w:strike/>
+            </w:pPr>
+            <w:r>
+              <w:rPr>
+                <w:rFonts w:ascii="Calibri" w:eastAsia="Calibri" w:hAnsi="Calibri" w:cs="Calibri"/>
+                <w:b/>
+                <w:bCs/>
                 <w:color w:val="C0392B"/>
                 <w:sz w:val="15"/>
                 <w:szCs w:val="15"/>
@@ -1685,16 +1648,14 @@
           <w:p>
             <w:pPr>
               <w:rPr>
-                <w:strike/>
-                <w:lang w:val="es-NI"/>
-              </w:rPr>
-            </w:pPr>
-            <w:r>
-              <w:rPr>
-                <w:rFonts w:ascii="Calibri" w:eastAsia="Calibri" w:hAnsi="Calibri" w:cs="Calibri"/>
-                <w:b/>
-                <w:bCs/>
-                <w:strike/>
+                <w:lang w:val="es-NI"/>
+              </w:rPr>
+            </w:pPr>
+            <w:r>
+              <w:rPr>
+                <w:rFonts w:ascii="Calibri" w:eastAsia="Calibri" w:hAnsi="Calibri" w:cs="Calibri"/>
+                <w:b/>
+                <w:bCs/>
                 <w:color w:val="1B2B4B"/>
                 <w:sz w:val="17"/>
                 <w:szCs w:val="17"/>
@@ -1724,14 +1685,12 @@
           <w:p>
             <w:pPr>
               <w:rPr>
-                <w:strike/>
-                <w:lang w:val="es-NI"/>
-              </w:rPr>
-            </w:pPr>
-            <w:r>
-              <w:rPr>
-                <w:rFonts w:ascii="Calibri" w:eastAsia="Calibri" w:hAnsi="Calibri" w:cs="Calibri"/>
-                <w:strike/>
+                <w:lang w:val="es-NI"/>
+              </w:rPr>
+            </w:pPr>
+            <w:r>
+              <w:rPr>
+                <w:rFonts w:ascii="Calibri" w:eastAsia="Calibri" w:hAnsi="Calibri" w:cs="Calibri"/>
                 <w:color w:val="1A1A2E"/>
                 <w:sz w:val="17"/>
                 <w:szCs w:val="17"/>
@@ -1743,7 +1702,6 @@
             <w:r>
               <w:rPr>
                 <w:rFonts w:ascii="Calibri" w:eastAsia="Calibri" w:hAnsi="Calibri" w:cs="Calibri"/>
-                <w:strike/>
                 <w:color w:val="1A1A2E"/>
                 <w:sz w:val="17"/>
                 <w:szCs w:val="17"/>
@@ -1755,7 +1713,6 @@
             <w:r>
               <w:rPr>
                 <w:rFonts w:ascii="Calibri" w:eastAsia="Calibri" w:hAnsi="Calibri" w:cs="Calibri"/>
-                <w:strike/>
                 <w:color w:val="1A1A2E"/>
                 <w:sz w:val="17"/>
                 <w:szCs w:val="17"/>
@@ -1787,7 +1744,6 @@
           <w:p>
             <w:pPr>
               <w:rPr>
-                <w:strike/>
                 <w:lang w:val="es-NI"/>
               </w:rPr>
             </w:pPr>
@@ -1813,7 +1769,6 @@
           <w:p>
             <w:pPr>
               <w:rPr>
-                <w:strike/>
                 <w:lang w:val="es-NI"/>
               </w:rPr>
             </w:pPr>
@@ -1839,7 +1794,6 @@
           <w:p>
             <w:pPr>
               <w:rPr>
-                <w:strike/>
                 <w:lang w:val="es-NI"/>
               </w:rPr>
             </w:pPr>
@@ -1865,16 +1819,14 @@
           <w:p>
             <w:pPr>
               <w:rPr>
-                <w:strike/>
-                <w:lang w:val="es-NI"/>
-              </w:rPr>
-            </w:pPr>
-            <w:r>
-              <w:rPr>
-                <w:rFonts w:ascii="Calibri" w:eastAsia="Calibri" w:hAnsi="Calibri" w:cs="Calibri"/>
-                <w:b/>
-                <w:bCs/>
-                <w:strike/>
+                <w:lang w:val="es-NI"/>
+              </w:rPr>
+            </w:pPr>
+            <w:r>
+              <w:rPr>
+                <w:rFonts w:ascii="Calibri" w:eastAsia="Calibri" w:hAnsi="Calibri" w:cs="Calibri"/>
+                <w:b/>
+                <w:bCs/>
                 <w:color w:val="0E7FD4"/>
                 <w:sz w:val="17"/>
                 <w:szCs w:val="17"/>
@@ -1885,7 +1837,6 @@
             <w:r>
               <w:rPr>
                 <w:rFonts w:ascii="Calibri" w:eastAsia="Calibri" w:hAnsi="Calibri" w:cs="Calibri"/>
-                <w:strike/>
                 <w:color w:val="1A1A2E"/>
                 <w:sz w:val="17"/>
                 <w:szCs w:val="17"/>
@@ -1917,7 +1868,6 @@
           <w:p>
             <w:pPr>
               <w:rPr>
-                <w:strike/>
                 <w:lang w:val="es-NI"/>
               </w:rPr>
             </w:pPr>
@@ -1943,7 +1893,6 @@
           <w:p>
             <w:pPr>
               <w:rPr>
-                <w:strike/>
                 <w:lang w:val="es-NI"/>
               </w:rPr>
             </w:pPr>
@@ -1969,7 +1918,6 @@
           <w:p>
             <w:pPr>
               <w:rPr>
-                <w:strike/>
                 <w:lang w:val="es-NI"/>
               </w:rPr>
             </w:pPr>
@@ -1995,16 +1943,14 @@
           <w:p>
             <w:pPr>
               <w:rPr>
-                <w:strike/>
-                <w:lang w:val="es-NI"/>
-              </w:rPr>
-            </w:pPr>
-            <w:r>
-              <w:rPr>
-                <w:rFonts w:ascii="Calibri" w:eastAsia="Calibri" w:hAnsi="Calibri" w:cs="Calibri"/>
-                <w:b/>
-                <w:bCs/>
-                <w:strike/>
+                <w:lang w:val="es-NI"/>
+              </w:rPr>
+            </w:pPr>
+            <w:r>
+              <w:rPr>
+                <w:rFonts w:ascii="Calibri" w:eastAsia="Calibri" w:hAnsi="Calibri" w:cs="Calibri"/>
+                <w:b/>
+                <w:bCs/>
                 <w:color w:val="0E7FD4"/>
                 <w:sz w:val="17"/>
                 <w:szCs w:val="17"/>
@@ -2015,7 +1961,6 @@
             <w:r>
               <w:rPr>
                 <w:rFonts w:ascii="Calibri" w:eastAsia="Calibri" w:hAnsi="Calibri" w:cs="Calibri"/>
-                <w:strike/>
                 <w:color w:val="1A1A2E"/>
                 <w:sz w:val="17"/>
                 <w:szCs w:val="17"/>
@@ -2047,7 +1992,6 @@
           <w:p>
             <w:pPr>
               <w:rPr>
-                <w:strike/>
                 <w:lang w:val="es-NI"/>
               </w:rPr>
             </w:pPr>
@@ -2073,7 +2017,6 @@
           <w:p>
             <w:pPr>
               <w:rPr>
-                <w:strike/>
                 <w:lang w:val="es-NI"/>
               </w:rPr>
             </w:pPr>
@@ -2099,7 +2042,6 @@
           <w:p>
             <w:pPr>
               <w:rPr>
-                <w:strike/>
                 <w:lang w:val="es-NI"/>
               </w:rPr>
             </w:pPr>
@@ -2125,16 +2067,14 @@
           <w:p>
             <w:pPr>
               <w:rPr>
-                <w:strike/>
-                <w:lang w:val="es-NI"/>
-              </w:rPr>
-            </w:pPr>
-            <w:r>
-              <w:rPr>
-                <w:rFonts w:ascii="Calibri" w:eastAsia="Calibri" w:hAnsi="Calibri" w:cs="Calibri"/>
-                <w:b/>
-                <w:bCs/>
-                <w:strike/>
+                <w:lang w:val="es-NI"/>
+              </w:rPr>
+            </w:pPr>
+            <w:r>
+              <w:rPr>
+                <w:rFonts w:ascii="Calibri" w:eastAsia="Calibri" w:hAnsi="Calibri" w:cs="Calibri"/>
+                <w:b/>
+                <w:bCs/>
                 <w:color w:val="0E7FD4"/>
                 <w:sz w:val="17"/>
                 <w:szCs w:val="17"/>
@@ -2145,7 +2085,6 @@
             <w:r>
               <w:rPr>
                 <w:rFonts w:ascii="Calibri" w:eastAsia="Calibri" w:hAnsi="Calibri" w:cs="Calibri"/>
-                <w:strike/>
                 <w:color w:val="1A1A2E"/>
                 <w:sz w:val="17"/>
                 <w:szCs w:val="17"/>
@@ -2197,17 +2136,11 @@
             </w:tcMar>
           </w:tcPr>
           <w:p>
-            <w:pPr>
-              <w:rPr>
-                <w:strike/>
-              </w:rPr>
-            </w:pPr>
-            <w:r>
-              <w:rPr>
-                <w:rFonts w:ascii="Calibri" w:eastAsia="Calibri" w:hAnsi="Calibri" w:cs="Calibri"/>
-                <w:b/>
-                <w:bCs/>
-                <w:strike/>
+            <w:r>
+              <w:rPr>
+                <w:rFonts w:ascii="Calibri" w:eastAsia="Calibri" w:hAnsi="Calibri" w:cs="Calibri"/>
+                <w:b/>
+                <w:bCs/>
                 <w:color w:val="0A5C9E"/>
                 <w:sz w:val="16"/>
                 <w:szCs w:val="16"/>
@@ -2237,16 +2170,12 @@
           <w:p>
             <w:pPr>
               <w:jc w:val="center"/>
-              <w:rPr>
-                <w:strike/>
-              </w:rPr>
-            </w:pPr>
-            <w:r>
-              <w:rPr>
-                <w:rFonts w:ascii="Calibri" w:eastAsia="Calibri" w:hAnsi="Calibri" w:cs="Calibri"/>
-                <w:b/>
-                <w:bCs/>
-                <w:strike/>
+            </w:pPr>
+            <w:r>
+              <w:rPr>
+                <w:rFonts w:ascii="Calibri" w:eastAsia="Calibri" w:hAnsi="Calibri" w:cs="Calibri"/>
+                <w:b/>
+                <w:bCs/>
                 <w:color w:val="C0392B"/>
                 <w:sz w:val="15"/>
                 <w:szCs w:val="15"/>
@@ -2275,16 +2204,14 @@
           <w:p>
             <w:pPr>
               <w:rPr>
-                <w:strike/>
-                <w:lang w:val="es-NI"/>
-              </w:rPr>
-            </w:pPr>
-            <w:r>
-              <w:rPr>
-                <w:rFonts w:ascii="Calibri" w:eastAsia="Calibri" w:hAnsi="Calibri" w:cs="Calibri"/>
-                <w:b/>
-                <w:bCs/>
-                <w:strike/>
+                <w:lang w:val="es-NI"/>
+              </w:rPr>
+            </w:pPr>
+            <w:r>
+              <w:rPr>
+                <w:rFonts w:ascii="Calibri" w:eastAsia="Calibri" w:hAnsi="Calibri" w:cs="Calibri"/>
+                <w:b/>
+                <w:bCs/>
                 <w:color w:val="1B2B4B"/>
                 <w:sz w:val="17"/>
                 <w:szCs w:val="17"/>
@@ -2314,14 +2241,12 @@
           <w:p>
             <w:pPr>
               <w:rPr>
-                <w:strike/>
-                <w:lang w:val="es-NI"/>
-              </w:rPr>
-            </w:pPr>
-            <w:r>
-              <w:rPr>
-                <w:rFonts w:ascii="Calibri" w:eastAsia="Calibri" w:hAnsi="Calibri" w:cs="Calibri"/>
-                <w:strike/>
+                <w:lang w:val="es-NI"/>
+              </w:rPr>
+            </w:pPr>
+            <w:r>
+              <w:rPr>
+                <w:rFonts w:ascii="Calibri" w:eastAsia="Calibri" w:hAnsi="Calibri" w:cs="Calibri"/>
                 <w:color w:val="1A1A2E"/>
                 <w:sz w:val="17"/>
                 <w:szCs w:val="17"/>
@@ -2333,7 +2258,6 @@
             <w:r>
               <w:rPr>
                 <w:rFonts w:ascii="Calibri" w:eastAsia="Calibri" w:hAnsi="Calibri" w:cs="Calibri"/>
-                <w:strike/>
                 <w:color w:val="1A1A2E"/>
                 <w:sz w:val="17"/>
                 <w:szCs w:val="17"/>
@@ -2345,7 +2269,6 @@
             <w:r>
               <w:rPr>
                 <w:rFonts w:ascii="Calibri" w:eastAsia="Calibri" w:hAnsi="Calibri" w:cs="Calibri"/>
-                <w:strike/>
                 <w:color w:val="1A1A2E"/>
                 <w:sz w:val="17"/>
                 <w:szCs w:val="17"/>
@@ -2377,7 +2300,6 @@
           <w:p>
             <w:pPr>
               <w:rPr>
-                <w:strike/>
                 <w:lang w:val="es-NI"/>
               </w:rPr>
             </w:pPr>
@@ -2403,7 +2325,6 @@
           <w:p>
             <w:pPr>
               <w:rPr>
-                <w:strike/>
                 <w:lang w:val="es-NI"/>
               </w:rPr>
             </w:pPr>
@@ -2429,7 +2350,6 @@
           <w:p>
             <w:pPr>
               <w:rPr>
-                <w:strike/>
                 <w:lang w:val="es-NI"/>
               </w:rPr>
             </w:pPr>
@@ -2455,16 +2375,14 @@
           <w:p>
             <w:pPr>
               <w:rPr>
-                <w:strike/>
-                <w:lang w:val="es-NI"/>
-              </w:rPr>
-            </w:pPr>
-            <w:r>
-              <w:rPr>
-                <w:rFonts w:ascii="Calibri" w:eastAsia="Calibri" w:hAnsi="Calibri" w:cs="Calibri"/>
-                <w:b/>
-                <w:bCs/>
-                <w:strike/>
+                <w:lang w:val="es-NI"/>
+              </w:rPr>
+            </w:pPr>
+            <w:r>
+              <w:rPr>
+                <w:rFonts w:ascii="Calibri" w:eastAsia="Calibri" w:hAnsi="Calibri" w:cs="Calibri"/>
+                <w:b/>
+                <w:bCs/>
                 <w:color w:val="0E7FD4"/>
                 <w:sz w:val="17"/>
                 <w:szCs w:val="17"/>
@@ -2475,7 +2393,6 @@
             <w:r>
               <w:rPr>
                 <w:rFonts w:ascii="Calibri" w:eastAsia="Calibri" w:hAnsi="Calibri" w:cs="Calibri"/>
-                <w:strike/>
                 <w:color w:val="1A1A2E"/>
                 <w:sz w:val="17"/>
                 <w:szCs w:val="17"/>
@@ -2502,7 +2419,6 @@
           <w:p>
             <w:pPr>
               <w:rPr>
-                <w:strike/>
                 <w:lang w:val="es-NI"/>
               </w:rPr>
             </w:pPr>
@@ -2528,17 +2444,11 @@
             </w:tcMar>
           </w:tcPr>
           <w:p>
-            <w:pPr>
-              <w:rPr>
-                <w:strike/>
-              </w:rPr>
-            </w:pPr>
-            <w:r>
-              <w:rPr>
-                <w:rFonts w:ascii="Calibri" w:eastAsia="Calibri" w:hAnsi="Calibri" w:cs="Calibri"/>
-                <w:b/>
-                <w:bCs/>
-                <w:strike/>
+            <w:r>
+              <w:rPr>
+                <w:rFonts w:ascii="Calibri" w:eastAsia="Calibri" w:hAnsi="Calibri" w:cs="Calibri"/>
+                <w:b/>
+                <w:bCs/>
                 <w:color w:val="0A5C9E"/>
                 <w:sz w:val="16"/>
                 <w:szCs w:val="16"/>
@@ -2567,9 +2477,6 @@
           <w:p>
             <w:pPr>
               <w:jc w:val="center"/>
-              <w:rPr>
-                <w:strike/>
-              </w:rPr>
             </w:pPr>
             <w:proofErr w:type="spellStart"/>
             <w:r>
@@ -2577,7 +2484,6 @@
                 <w:rFonts w:ascii="Calibri" w:eastAsia="Calibri" w:hAnsi="Calibri" w:cs="Calibri"/>
                 <w:b/>
                 <w:bCs/>
-                <w:strike/>
                 <w:color w:val="D35400"/>
                 <w:sz w:val="15"/>
                 <w:szCs w:val="15"/>
@@ -2605,18 +2511,12 @@
             </w:tcMar>
           </w:tcPr>
           <w:p>
-            <w:pPr>
-              <w:rPr>
-                <w:strike/>
-              </w:rPr>
-            </w:pPr>
             <w:proofErr w:type="spellStart"/>
             <w:r>
               <w:rPr>
                 <w:rFonts w:ascii="Calibri" w:eastAsia="Calibri" w:hAnsi="Calibri" w:cs="Calibri"/>
                 <w:b/>
                 <w:bCs/>
-                <w:strike/>
                 <w:color w:val="1B2B4B"/>
                 <w:sz w:val="17"/>
                 <w:szCs w:val="17"/>
@@ -2629,7 +2529,6 @@
                 <w:rFonts w:ascii="Calibri" w:eastAsia="Calibri" w:hAnsi="Calibri" w:cs="Calibri"/>
                 <w:b/>
                 <w:bCs/>
-                <w:strike/>
                 <w:color w:val="1B2B4B"/>
                 <w:sz w:val="17"/>
                 <w:szCs w:val="17"/>
@@ -2642,7 +2541,6 @@
                 <w:rFonts w:ascii="Calibri" w:eastAsia="Calibri" w:hAnsi="Calibri" w:cs="Calibri"/>
                 <w:b/>
                 <w:bCs/>
-                <w:strike/>
                 <w:color w:val="1B2B4B"/>
                 <w:sz w:val="17"/>
                 <w:szCs w:val="17"/>
@@ -2655,7 +2553,6 @@
                 <w:rFonts w:ascii="Calibri" w:eastAsia="Calibri" w:hAnsi="Calibri" w:cs="Calibri"/>
                 <w:b/>
                 <w:bCs/>
-                <w:strike/>
                 <w:color w:val="1B2B4B"/>
                 <w:sz w:val="17"/>
                 <w:szCs w:val="17"/>
@@ -2668,7 +2565,6 @@
                 <w:rFonts w:ascii="Calibri" w:eastAsia="Calibri" w:hAnsi="Calibri" w:cs="Calibri"/>
                 <w:b/>
                 <w:bCs/>
-                <w:strike/>
                 <w:color w:val="1B2B4B"/>
                 <w:sz w:val="17"/>
                 <w:szCs w:val="17"/>
@@ -2698,14 +2594,12 @@
           <w:p>
             <w:pPr>
               <w:rPr>
-                <w:strike/>
-                <w:lang w:val="es-NI"/>
-              </w:rPr>
-            </w:pPr>
-            <w:r>
-              <w:rPr>
-                <w:rFonts w:ascii="Calibri" w:eastAsia="Calibri" w:hAnsi="Calibri" w:cs="Calibri"/>
-                <w:strike/>
+                <w:lang w:val="es-NI"/>
+              </w:rPr>
+            </w:pPr>
+            <w:r>
+              <w:rPr>
+                <w:rFonts w:ascii="Calibri" w:eastAsia="Calibri" w:hAnsi="Calibri" w:cs="Calibri"/>
                 <w:color w:val="1A1A2E"/>
                 <w:sz w:val="17"/>
                 <w:szCs w:val="17"/>
@@ -2737,7 +2631,6 @@
           <w:p>
             <w:pPr>
               <w:rPr>
-                <w:strike/>
                 <w:lang w:val="es-NI"/>
               </w:rPr>
             </w:pPr>
@@ -2763,7 +2656,6 @@
           <w:p>
             <w:pPr>
               <w:rPr>
-                <w:strike/>
                 <w:lang w:val="es-NI"/>
               </w:rPr>
             </w:pPr>
@@ -2789,7 +2681,6 @@
           <w:p>
             <w:pPr>
               <w:rPr>
-                <w:strike/>
                 <w:lang w:val="es-NI"/>
               </w:rPr>
             </w:pPr>
@@ -2815,16 +2706,14 @@
           <w:p>
             <w:pPr>
               <w:rPr>
-                <w:strike/>
-                <w:lang w:val="es-NI"/>
-              </w:rPr>
-            </w:pPr>
-            <w:r>
-              <w:rPr>
-                <w:rFonts w:ascii="Calibri" w:eastAsia="Calibri" w:hAnsi="Calibri" w:cs="Calibri"/>
-                <w:b/>
-                <w:bCs/>
-                <w:strike/>
+                <w:lang w:val="es-NI"/>
+              </w:rPr>
+            </w:pPr>
+            <w:r>
+              <w:rPr>
+                <w:rFonts w:ascii="Calibri" w:eastAsia="Calibri" w:hAnsi="Calibri" w:cs="Calibri"/>
+                <w:b/>
+                <w:bCs/>
                 <w:color w:val="0E7FD4"/>
                 <w:sz w:val="17"/>
                 <w:szCs w:val="17"/>
@@ -2835,7 +2724,6 @@
             <w:r>
               <w:rPr>
                 <w:rFonts w:ascii="Calibri" w:eastAsia="Calibri" w:hAnsi="Calibri" w:cs="Calibri"/>
-                <w:strike/>
                 <w:color w:val="1A1A2E"/>
                 <w:sz w:val="17"/>
                 <w:szCs w:val="17"/>
@@ -2867,7 +2755,6 @@
           <w:p>
             <w:pPr>
               <w:rPr>
-                <w:strike/>
                 <w:lang w:val="es-NI"/>
               </w:rPr>
             </w:pPr>
@@ -2893,7 +2780,6 @@
           <w:p>
             <w:pPr>
               <w:rPr>
-                <w:strike/>
                 <w:lang w:val="es-NI"/>
               </w:rPr>
             </w:pPr>
@@ -2919,7 +2805,6 @@
           <w:p>
             <w:pPr>
               <w:rPr>
-                <w:strike/>
                 <w:lang w:val="es-NI"/>
               </w:rPr>
             </w:pPr>
@@ -2945,16 +2830,14 @@
           <w:p>
             <w:pPr>
               <w:rPr>
-                <w:strike/>
-                <w:lang w:val="es-NI"/>
-              </w:rPr>
-            </w:pPr>
-            <w:r>
-              <w:rPr>
-                <w:rFonts w:ascii="Calibri" w:eastAsia="Calibri" w:hAnsi="Calibri" w:cs="Calibri"/>
-                <w:b/>
-                <w:bCs/>
-                <w:strike/>
+                <w:lang w:val="es-NI"/>
+              </w:rPr>
+            </w:pPr>
+            <w:r>
+              <w:rPr>
+                <w:rFonts w:ascii="Calibri" w:eastAsia="Calibri" w:hAnsi="Calibri" w:cs="Calibri"/>
+                <w:b/>
+                <w:bCs/>
                 <w:color w:val="0E7FD4"/>
                 <w:sz w:val="17"/>
                 <w:szCs w:val="17"/>
@@ -2965,7 +2848,6 @@
             <w:r>
               <w:rPr>
                 <w:rFonts w:ascii="Calibri" w:eastAsia="Calibri" w:hAnsi="Calibri" w:cs="Calibri"/>
-                <w:strike/>
                 <w:color w:val="1A1A2E"/>
                 <w:sz w:val="17"/>
                 <w:szCs w:val="17"/>
@@ -2976,7 +2858,6 @@
             <w:r>
               <w:rPr>
                 <w:rFonts w:ascii="Calibri" w:eastAsia="Calibri" w:hAnsi="Calibri" w:cs="Calibri"/>
-                <w:strike/>
                 <w:color w:val="1A1A2E"/>
                 <w:sz w:val="17"/>
                 <w:szCs w:val="17"/>
@@ -2987,7 +2868,6 @@
             <w:r>
               <w:rPr>
                 <w:rFonts w:ascii="Calibri" w:eastAsia="Calibri" w:hAnsi="Calibri" w:cs="Calibri"/>
-                <w:strike/>
                 <w:color w:val="1A1A2E"/>
                 <w:sz w:val="17"/>
                 <w:szCs w:val="17"/>
@@ -3014,7 +2894,6 @@
           <w:p>
             <w:pPr>
               <w:rPr>
-                <w:strike/>
                 <w:lang w:val="es-NI"/>
               </w:rPr>
             </w:pPr>
@@ -3040,17 +2919,11 @@
             </w:tcMar>
           </w:tcPr>
           <w:p>
-            <w:pPr>
-              <w:rPr>
-                <w:strike/>
-              </w:rPr>
-            </w:pPr>
-            <w:r>
-              <w:rPr>
-                <w:rFonts w:ascii="Calibri" w:eastAsia="Calibri" w:hAnsi="Calibri" w:cs="Calibri"/>
-                <w:b/>
-                <w:bCs/>
-                <w:strike/>
+            <w:r>
+              <w:rPr>
+                <w:rFonts w:ascii="Calibri" w:eastAsia="Calibri" w:hAnsi="Calibri" w:cs="Calibri"/>
+                <w:b/>
+                <w:bCs/>
                 <w:color w:val="0A5C9E"/>
                 <w:sz w:val="16"/>
                 <w:szCs w:val="16"/>
@@ -3079,16 +2952,12 @@
           <w:p>
             <w:pPr>
               <w:jc w:val="center"/>
-              <w:rPr>
-                <w:strike/>
-              </w:rPr>
-            </w:pPr>
-            <w:r>
-              <w:rPr>
-                <w:rFonts w:ascii="Calibri" w:eastAsia="Calibri" w:hAnsi="Calibri" w:cs="Calibri"/>
-                <w:b/>
-                <w:bCs/>
-                <w:strike/>
+            </w:pPr>
+            <w:r>
+              <w:rPr>
+                <w:rFonts w:ascii="Calibri" w:eastAsia="Calibri" w:hAnsi="Calibri" w:cs="Calibri"/>
+                <w:b/>
+                <w:bCs/>
                 <w:color w:val="C0392B"/>
                 <w:sz w:val="15"/>
                 <w:szCs w:val="15"/>
@@ -3117,16 +2986,14 @@
           <w:p>
             <w:pPr>
               <w:rPr>
-                <w:strike/>
-                <w:lang w:val="es-NI"/>
-              </w:rPr>
-            </w:pPr>
-            <w:r>
-              <w:rPr>
-                <w:rFonts w:ascii="Calibri" w:eastAsia="Calibri" w:hAnsi="Calibri" w:cs="Calibri"/>
-                <w:b/>
-                <w:bCs/>
-                <w:strike/>
+                <w:lang w:val="es-NI"/>
+              </w:rPr>
+            </w:pPr>
+            <w:r>
+              <w:rPr>
+                <w:rFonts w:ascii="Calibri" w:eastAsia="Calibri" w:hAnsi="Calibri" w:cs="Calibri"/>
+                <w:b/>
+                <w:bCs/>
                 <w:color w:val="1B2B4B"/>
                 <w:sz w:val="17"/>
                 <w:szCs w:val="17"/>
@@ -3156,14 +3023,12 @@
           <w:p>
             <w:pPr>
               <w:rPr>
-                <w:strike/>
-                <w:lang w:val="es-NI"/>
-              </w:rPr>
-            </w:pPr>
-            <w:r>
-              <w:rPr>
-                <w:rFonts w:ascii="Calibri" w:eastAsia="Calibri" w:hAnsi="Calibri" w:cs="Calibri"/>
-                <w:strike/>
+                <w:lang w:val="es-NI"/>
+              </w:rPr>
+            </w:pPr>
+            <w:r>
+              <w:rPr>
+                <w:rFonts w:ascii="Calibri" w:eastAsia="Calibri" w:hAnsi="Calibri" w:cs="Calibri"/>
                 <w:color w:val="1A1A2E"/>
                 <w:sz w:val="17"/>
                 <w:szCs w:val="17"/>
@@ -3195,7 +3060,6 @@
           <w:p>
             <w:pPr>
               <w:rPr>
-                <w:strike/>
                 <w:lang w:val="es-NI"/>
               </w:rPr>
             </w:pPr>
@@ -3221,7 +3085,6 @@
           <w:p>
             <w:pPr>
               <w:rPr>
-                <w:strike/>
                 <w:lang w:val="es-NI"/>
               </w:rPr>
             </w:pPr>
@@ -3247,7 +3110,6 @@
           <w:p>
             <w:pPr>
               <w:rPr>
-                <w:strike/>
                 <w:lang w:val="es-NI"/>
               </w:rPr>
             </w:pPr>
@@ -3273,16 +3135,14 @@
           <w:p>
             <w:pPr>
               <w:rPr>
-                <w:strike/>
-                <w:lang w:val="es-NI"/>
-              </w:rPr>
-            </w:pPr>
-            <w:r>
-              <w:rPr>
-                <w:rFonts w:ascii="Calibri" w:eastAsia="Calibri" w:hAnsi="Calibri" w:cs="Calibri"/>
-                <w:b/>
-                <w:bCs/>
-                <w:strike/>
+                <w:lang w:val="es-NI"/>
+              </w:rPr>
+            </w:pPr>
+            <w:r>
+              <w:rPr>
+                <w:rFonts w:ascii="Calibri" w:eastAsia="Calibri" w:hAnsi="Calibri" w:cs="Calibri"/>
+                <w:b/>
+                <w:bCs/>
                 <w:color w:val="0E7FD4"/>
                 <w:sz w:val="17"/>
                 <w:szCs w:val="17"/>
@@ -3293,7 +3153,6 @@
             <w:r>
               <w:rPr>
                 <w:rFonts w:ascii="Calibri" w:eastAsia="Calibri" w:hAnsi="Calibri" w:cs="Calibri"/>
-                <w:strike/>
                 <w:color w:val="1A1A2E"/>
                 <w:sz w:val="17"/>
                 <w:szCs w:val="17"/>
@@ -3325,7 +3184,6 @@
           <w:p>
             <w:pPr>
               <w:rPr>
-                <w:strike/>
                 <w:lang w:val="es-NI"/>
               </w:rPr>
             </w:pPr>
@@ -3351,7 +3209,6 @@
           <w:p>
             <w:pPr>
               <w:rPr>
-                <w:strike/>
                 <w:lang w:val="es-NI"/>
               </w:rPr>
             </w:pPr>
@@ -3377,7 +3234,6 @@
           <w:p>
             <w:pPr>
               <w:rPr>
-                <w:strike/>
                 <w:lang w:val="es-NI"/>
               </w:rPr>
             </w:pPr>
@@ -3403,16 +3259,14 @@
           <w:p>
             <w:pPr>
               <w:rPr>
-                <w:strike/>
-                <w:lang w:val="es-NI"/>
-              </w:rPr>
-            </w:pPr>
-            <w:r>
-              <w:rPr>
-                <w:rFonts w:ascii="Calibri" w:eastAsia="Calibri" w:hAnsi="Calibri" w:cs="Calibri"/>
-                <w:b/>
-                <w:bCs/>
-                <w:strike/>
+                <w:lang w:val="es-NI"/>
+              </w:rPr>
+            </w:pPr>
+            <w:r>
+              <w:rPr>
+                <w:rFonts w:ascii="Calibri" w:eastAsia="Calibri" w:hAnsi="Calibri" w:cs="Calibri"/>
+                <w:b/>
+                <w:bCs/>
                 <w:color w:val="0E7FD4"/>
                 <w:sz w:val="17"/>
                 <w:szCs w:val="17"/>
@@ -3423,7 +3277,6 @@
             <w:r>
               <w:rPr>
                 <w:rFonts w:ascii="Calibri" w:eastAsia="Calibri" w:hAnsi="Calibri" w:cs="Calibri"/>
-                <w:strike/>
                 <w:color w:val="1A1A2E"/>
                 <w:sz w:val="17"/>
                 <w:szCs w:val="17"/>
@@ -3455,7 +3308,6 @@
           <w:p>
             <w:pPr>
               <w:rPr>
-                <w:strike/>
                 <w:lang w:val="es-NI"/>
               </w:rPr>
             </w:pPr>
@@ -3481,7 +3333,6 @@
           <w:p>
             <w:pPr>
               <w:rPr>
-                <w:strike/>
                 <w:lang w:val="es-NI"/>
               </w:rPr>
             </w:pPr>
@@ -3507,7 +3358,6 @@
           <w:p>
             <w:pPr>
               <w:rPr>
-                <w:strike/>
                 <w:lang w:val="es-NI"/>
               </w:rPr>
             </w:pPr>
@@ -3533,16 +3383,14 @@
           <w:p>
             <w:pPr>
               <w:rPr>
-                <w:strike/>
-                <w:lang w:val="es-NI"/>
-              </w:rPr>
-            </w:pPr>
-            <w:r>
-              <w:rPr>
-                <w:rFonts w:ascii="Calibri" w:eastAsia="Calibri" w:hAnsi="Calibri" w:cs="Calibri"/>
-                <w:b/>
-                <w:bCs/>
-                <w:strike/>
+                <w:lang w:val="es-NI"/>
+              </w:rPr>
+            </w:pPr>
+            <w:r>
+              <w:rPr>
+                <w:rFonts w:ascii="Calibri" w:eastAsia="Calibri" w:hAnsi="Calibri" w:cs="Calibri"/>
+                <w:b/>
+                <w:bCs/>
                 <w:color w:val="0E7FD4"/>
                 <w:sz w:val="17"/>
                 <w:szCs w:val="17"/>
@@ -3553,7 +3401,6 @@
             <w:r>
               <w:rPr>
                 <w:rFonts w:ascii="Calibri" w:eastAsia="Calibri" w:hAnsi="Calibri" w:cs="Calibri"/>
-                <w:strike/>
                 <w:color w:val="1A1A2E"/>
                 <w:sz w:val="17"/>
                 <w:szCs w:val="17"/>
@@ -3638,9 +3485,6 @@
           <w:p>
             <w:pPr>
               <w:jc w:val="center"/>
-              <w:rPr>
-                <w:strike/>
-              </w:rPr>
             </w:pPr>
             <w:proofErr w:type="spellStart"/>
             <w:r>
@@ -3648,7 +3492,6 @@
                 <w:rFonts w:ascii="Calibri" w:eastAsia="Calibri" w:hAnsi="Calibri" w:cs="Calibri"/>
                 <w:b/>
                 <w:bCs/>
-                <w:strike/>
                 <w:color w:val="D35400"/>
                 <w:sz w:val="15"/>
                 <w:szCs w:val="15"/>
@@ -3678,16 +3521,14 @@
           <w:p>
             <w:pPr>
               <w:rPr>
-                <w:strike/>
-                <w:lang w:val="es-NI"/>
-              </w:rPr>
-            </w:pPr>
-            <w:r>
-              <w:rPr>
-                <w:rFonts w:ascii="Calibri" w:eastAsia="Calibri" w:hAnsi="Calibri" w:cs="Calibri"/>
-                <w:b/>
-                <w:bCs/>
-                <w:strike/>
+                <w:lang w:val="es-NI"/>
+              </w:rPr>
+            </w:pPr>
+            <w:r>
+              <w:rPr>
+                <w:rFonts w:ascii="Calibri" w:eastAsia="Calibri" w:hAnsi="Calibri" w:cs="Calibri"/>
+                <w:b/>
+                <w:bCs/>
                 <w:color w:val="1B2B4B"/>
                 <w:sz w:val="17"/>
                 <w:szCs w:val="17"/>
@@ -3717,14 +3558,12 @@
           <w:p>
             <w:pPr>
               <w:rPr>
-                <w:strike/>
-                <w:lang w:val="es-NI"/>
-              </w:rPr>
-            </w:pPr>
-            <w:r>
-              <w:rPr>
-                <w:rFonts w:ascii="Calibri" w:eastAsia="Calibri" w:hAnsi="Calibri" w:cs="Calibri"/>
-                <w:strike/>
+                <w:lang w:val="es-NI"/>
+              </w:rPr>
+            </w:pPr>
+            <w:r>
+              <w:rPr>
+                <w:rFonts w:ascii="Calibri" w:eastAsia="Calibri" w:hAnsi="Calibri" w:cs="Calibri"/>
                 <w:color w:val="1A1A2E"/>
                 <w:sz w:val="17"/>
                 <w:szCs w:val="17"/>
@@ -3735,7 +3574,6 @@
             <w:r>
               <w:rPr>
                 <w:rFonts w:ascii="Calibri" w:eastAsia="Calibri" w:hAnsi="Calibri" w:cs="Calibri"/>
-                <w:strike/>
                 <w:color w:val="1A1A2E"/>
                 <w:sz w:val="17"/>
                 <w:szCs w:val="17"/>
@@ -3746,7 +3584,6 @@
             <w:r>
               <w:rPr>
                 <w:rFonts w:ascii="Calibri" w:eastAsia="Calibri" w:hAnsi="Calibri" w:cs="Calibri"/>
-                <w:strike/>
                 <w:color w:val="1A1A2E"/>
                 <w:sz w:val="17"/>
                 <w:szCs w:val="17"/>
@@ -3803,7 +3640,6 @@
           <w:p>
             <w:pPr>
               <w:rPr>
-                <w:strike/>
                 <w:lang w:val="es-NI"/>
               </w:rPr>
             </w:pPr>
@@ -3829,7 +3665,6 @@
           <w:p>
             <w:pPr>
               <w:rPr>
-                <w:strike/>
                 <w:lang w:val="es-NI"/>
               </w:rPr>
             </w:pPr>
@@ -3855,16 +3690,14 @@
           <w:p>
             <w:pPr>
               <w:rPr>
-                <w:strike/>
-                <w:lang w:val="es-NI"/>
-              </w:rPr>
-            </w:pPr>
-            <w:r>
-              <w:rPr>
-                <w:rFonts w:ascii="Calibri" w:eastAsia="Calibri" w:hAnsi="Calibri" w:cs="Calibri"/>
-                <w:b/>
-                <w:bCs/>
-                <w:strike/>
+                <w:lang w:val="es-NI"/>
+              </w:rPr>
+            </w:pPr>
+            <w:r>
+              <w:rPr>
+                <w:rFonts w:ascii="Calibri" w:eastAsia="Calibri" w:hAnsi="Calibri" w:cs="Calibri"/>
+                <w:b/>
+                <w:bCs/>
                 <w:color w:val="0E7FD4"/>
                 <w:sz w:val="17"/>
                 <w:szCs w:val="17"/>
@@ -3875,7 +3708,6 @@
             <w:r>
               <w:rPr>
                 <w:rFonts w:ascii="Calibri" w:eastAsia="Calibri" w:hAnsi="Calibri" w:cs="Calibri"/>
-                <w:strike/>
                 <w:color w:val="1A1A2E"/>
                 <w:sz w:val="17"/>
                 <w:szCs w:val="17"/>
@@ -3886,7 +3718,6 @@
             <w:r>
               <w:rPr>
                 <w:rFonts w:ascii="Calibri" w:eastAsia="Calibri" w:hAnsi="Calibri" w:cs="Calibri"/>
-                <w:strike/>
                 <w:color w:val="1A1A2E"/>
                 <w:sz w:val="17"/>
                 <w:szCs w:val="17"/>
@@ -3897,7 +3728,6 @@
             <w:r>
               <w:rPr>
                 <w:rFonts w:ascii="Calibri" w:eastAsia="Calibri" w:hAnsi="Calibri" w:cs="Calibri"/>
-                <w:strike/>
                 <w:color w:val="1A1A2E"/>
                 <w:sz w:val="17"/>
                 <w:szCs w:val="17"/>
@@ -3954,7 +3784,6 @@
           <w:p>
             <w:pPr>
               <w:rPr>
-                <w:strike/>
                 <w:lang w:val="es-NI"/>
               </w:rPr>
             </w:pPr>
@@ -3980,7 +3809,6 @@
           <w:p>
             <w:pPr>
               <w:rPr>
-                <w:strike/>
                 <w:lang w:val="es-NI"/>
               </w:rPr>
             </w:pPr>
@@ -4006,16 +3834,14 @@
           <w:p>
             <w:pPr>
               <w:rPr>
-                <w:strike/>
-                <w:lang w:val="es-NI"/>
-              </w:rPr>
-            </w:pPr>
-            <w:r>
-              <w:rPr>
-                <w:rFonts w:ascii="Calibri" w:eastAsia="Calibri" w:hAnsi="Calibri" w:cs="Calibri"/>
-                <w:b/>
-                <w:bCs/>
-                <w:strike/>
+                <w:lang w:val="es-NI"/>
+              </w:rPr>
+            </w:pPr>
+            <w:r>
+              <w:rPr>
+                <w:rFonts w:ascii="Calibri" w:eastAsia="Calibri" w:hAnsi="Calibri" w:cs="Calibri"/>
+                <w:b/>
+                <w:bCs/>
                 <w:color w:val="0E7FD4"/>
                 <w:sz w:val="17"/>
                 <w:szCs w:val="17"/>
@@ -4026,7 +3852,6 @@
             <w:r>
               <w:rPr>
                 <w:rFonts w:ascii="Calibri" w:eastAsia="Calibri" w:hAnsi="Calibri" w:cs="Calibri"/>
-                <w:strike/>
                 <w:color w:val="1A1A2E"/>
                 <w:sz w:val="17"/>
                 <w:szCs w:val="17"/>
@@ -4083,7 +3908,6 @@
           <w:p>
             <w:pPr>
               <w:rPr>
-                <w:strike/>
                 <w:lang w:val="es-NI"/>
               </w:rPr>
             </w:pPr>
@@ -4109,7 +3933,6 @@
           <w:p>
             <w:pPr>
               <w:rPr>
-                <w:strike/>
                 <w:lang w:val="es-NI"/>
               </w:rPr>
             </w:pPr>
@@ -4135,16 +3958,14 @@
           <w:p>
             <w:pPr>
               <w:rPr>
-                <w:strike/>
-                <w:lang w:val="es-NI"/>
-              </w:rPr>
-            </w:pPr>
-            <w:r>
-              <w:rPr>
-                <w:rFonts w:ascii="Calibri" w:eastAsia="Calibri" w:hAnsi="Calibri" w:cs="Calibri"/>
-                <w:b/>
-                <w:bCs/>
-                <w:strike/>
+                <w:lang w:val="es-NI"/>
+              </w:rPr>
+            </w:pPr>
+            <w:r>
+              <w:rPr>
+                <w:rFonts w:ascii="Calibri" w:eastAsia="Calibri" w:hAnsi="Calibri" w:cs="Calibri"/>
+                <w:b/>
+                <w:bCs/>
                 <w:color w:val="0E7FD4"/>
                 <w:sz w:val="17"/>
                 <w:szCs w:val="17"/>
@@ -4155,7 +3976,6 @@
             <w:r>
               <w:rPr>
                 <w:rFonts w:ascii="Calibri" w:eastAsia="Calibri" w:hAnsi="Calibri" w:cs="Calibri"/>
-                <w:strike/>
                 <w:color w:val="1A1A2E"/>
                 <w:sz w:val="17"/>
                 <w:szCs w:val="17"/>
@@ -4166,7 +3986,6 @@
             <w:r>
               <w:rPr>
                 <w:rFonts w:ascii="Calibri" w:eastAsia="Calibri" w:hAnsi="Calibri" w:cs="Calibri"/>
-                <w:strike/>
                 <w:color w:val="1A1A2E"/>
                 <w:sz w:val="17"/>
                 <w:szCs w:val="17"/>
@@ -4177,7 +3996,6 @@
             <w:r>
               <w:rPr>
                 <w:rFonts w:ascii="Calibri" w:eastAsia="Calibri" w:hAnsi="Calibri" w:cs="Calibri"/>
-                <w:strike/>
                 <w:color w:val="1A1A2E"/>
                 <w:sz w:val="17"/>
                 <w:szCs w:val="17"/>
@@ -4602,19 +4420,7 @@
                 <w:szCs w:val="17"/>
                 <w:lang w:val="es-NI"/>
               </w:rPr>
-              <w:t>2</w:t>
-            </w:r>
-            <w:r>
-              <w:rPr>
-                <w:rFonts w:ascii="Calibri" w:eastAsia="Calibri" w:hAnsi="Calibri" w:cs="Calibri"/>
-                <w:b/>
-                <w:bCs/>
-                <w:color w:val="0E7FD4"/>
-                <w:sz w:val="17"/>
-                <w:szCs w:val="17"/>
-                <w:lang w:val="es-NI"/>
-              </w:rPr>
-              <w:t xml:space="preserve">. </w:t>
+              <w:t xml:space="preserve">2. </w:t>
             </w:r>
             <w:r>
               <w:rPr>
@@ -4624,17 +4430,7 @@
                 <w:szCs w:val="17"/>
                 <w:lang w:val="es-NI"/>
               </w:rPr>
-              <w:t>La información actualizada no debe afectar con la operativa o integridad del pago ya sea proveniente de una prima, reclamo, etc</w:t>
-            </w:r>
-            <w:r>
-              <w:rPr>
-                <w:rFonts w:ascii="Calibri" w:eastAsia="Calibri" w:hAnsi="Calibri" w:cs="Calibri"/>
-                <w:color w:val="1A1A2E"/>
-                <w:sz w:val="17"/>
-                <w:szCs w:val="17"/>
-                <w:lang w:val="es-NI"/>
-              </w:rPr>
-              <w:t>.</w:t>
+              <w:t>La información actualizada no debe afectar con la operativa o integridad del pago ya sea proveniente de una prima, reclamo, etc.</w:t>
             </w:r>
           </w:p>
         </w:tc>
@@ -4680,17 +4476,11 @@
             </w:tcMar>
           </w:tcPr>
           <w:p>
-            <w:pPr>
-              <w:rPr>
-                <w:strike/>
-              </w:rPr>
-            </w:pPr>
-            <w:r>
-              <w:rPr>
-                <w:rFonts w:ascii="Calibri" w:eastAsia="Calibri" w:hAnsi="Calibri" w:cs="Calibri"/>
-                <w:b/>
-                <w:bCs/>
-                <w:strike/>
+            <w:r>
+              <w:rPr>
+                <w:rFonts w:ascii="Calibri" w:eastAsia="Calibri" w:hAnsi="Calibri" w:cs="Calibri"/>
+                <w:b/>
+                <w:bCs/>
                 <w:color w:val="0A5C9E"/>
                 <w:sz w:val="16"/>
                 <w:szCs w:val="16"/>
@@ -4719,9 +4509,6 @@
           <w:p>
             <w:pPr>
               <w:jc w:val="center"/>
-              <w:rPr>
-                <w:strike/>
-              </w:rPr>
             </w:pPr>
             <w:proofErr w:type="spellStart"/>
             <w:r>
@@ -4729,7 +4516,6 @@
                 <w:rFonts w:ascii="Calibri" w:eastAsia="Calibri" w:hAnsi="Calibri" w:cs="Calibri"/>
                 <w:b/>
                 <w:bCs/>
-                <w:strike/>
                 <w:color w:val="D35400"/>
                 <w:sz w:val="15"/>
                 <w:szCs w:val="15"/>
@@ -4757,18 +4543,12 @@
             </w:tcMar>
           </w:tcPr>
           <w:p>
-            <w:pPr>
-              <w:rPr>
-                <w:strike/>
-              </w:rPr>
-            </w:pPr>
             <w:proofErr w:type="spellStart"/>
             <w:r>
               <w:rPr>
                 <w:rFonts w:ascii="Calibri" w:eastAsia="Calibri" w:hAnsi="Calibri" w:cs="Calibri"/>
                 <w:b/>
                 <w:bCs/>
-                <w:strike/>
                 <w:color w:val="1B2B4B"/>
                 <w:sz w:val="17"/>
                 <w:szCs w:val="17"/>
@@ -4781,7 +4561,6 @@
                 <w:rFonts w:ascii="Calibri" w:eastAsia="Calibri" w:hAnsi="Calibri" w:cs="Calibri"/>
                 <w:b/>
                 <w:bCs/>
-                <w:strike/>
                 <w:color w:val="1B2B4B"/>
                 <w:sz w:val="17"/>
                 <w:szCs w:val="17"/>
@@ -4794,7 +4573,6 @@
                 <w:rFonts w:ascii="Calibri" w:eastAsia="Calibri" w:hAnsi="Calibri" w:cs="Calibri"/>
                 <w:b/>
                 <w:bCs/>
-                <w:strike/>
                 <w:color w:val="1B2B4B"/>
                 <w:sz w:val="17"/>
                 <w:szCs w:val="17"/>
@@ -4824,14 +4602,12 @@
           <w:p>
             <w:pPr>
               <w:rPr>
-                <w:strike/>
-                <w:lang w:val="es-NI"/>
-              </w:rPr>
-            </w:pPr>
-            <w:r>
-              <w:rPr>
-                <w:rFonts w:ascii="Calibri" w:eastAsia="Calibri" w:hAnsi="Calibri" w:cs="Calibri"/>
-                <w:strike/>
+                <w:lang w:val="es-NI"/>
+              </w:rPr>
+            </w:pPr>
+            <w:r>
+              <w:rPr>
+                <w:rFonts w:ascii="Calibri" w:eastAsia="Calibri" w:hAnsi="Calibri" w:cs="Calibri"/>
                 <w:color w:val="1A1A2E"/>
                 <w:sz w:val="17"/>
                 <w:szCs w:val="17"/>
@@ -4863,7 +4639,6 @@
           <w:p>
             <w:pPr>
               <w:rPr>
-                <w:strike/>
                 <w:lang w:val="es-NI"/>
               </w:rPr>
             </w:pPr>
@@ -4889,7 +4664,6 @@
           <w:p>
             <w:pPr>
               <w:rPr>
-                <w:strike/>
                 <w:lang w:val="es-NI"/>
               </w:rPr>
             </w:pPr>
@@ -4915,7 +4689,6 @@
           <w:p>
             <w:pPr>
               <w:rPr>
-                <w:strike/>
                 <w:lang w:val="es-NI"/>
               </w:rPr>
             </w:pPr>
@@ -4941,16 +4714,14 @@
           <w:p>
             <w:pPr>
               <w:rPr>
-                <w:strike/>
-                <w:lang w:val="es-NI"/>
-              </w:rPr>
-            </w:pPr>
-            <w:r>
-              <w:rPr>
-                <w:rFonts w:ascii="Calibri" w:eastAsia="Calibri" w:hAnsi="Calibri" w:cs="Calibri"/>
-                <w:b/>
-                <w:bCs/>
-                <w:strike/>
+                <w:lang w:val="es-NI"/>
+              </w:rPr>
+            </w:pPr>
+            <w:r>
+              <w:rPr>
+                <w:rFonts w:ascii="Calibri" w:eastAsia="Calibri" w:hAnsi="Calibri" w:cs="Calibri"/>
+                <w:b/>
+                <w:bCs/>
                 <w:color w:val="0E7FD4"/>
                 <w:sz w:val="17"/>
                 <w:szCs w:val="17"/>
@@ -4961,7 +4732,6 @@
             <w:r>
               <w:rPr>
                 <w:rFonts w:ascii="Calibri" w:eastAsia="Calibri" w:hAnsi="Calibri" w:cs="Calibri"/>
-                <w:strike/>
                 <w:color w:val="1A1A2E"/>
                 <w:sz w:val="17"/>
                 <w:szCs w:val="17"/>
@@ -4972,7 +4742,6 @@
             <w:r>
               <w:rPr>
                 <w:rFonts w:ascii="Calibri" w:eastAsia="Calibri" w:hAnsi="Calibri" w:cs="Calibri"/>
-                <w:strike/>
                 <w:color w:val="1A1A2E"/>
                 <w:sz w:val="17"/>
                 <w:szCs w:val="17"/>
@@ -4983,7 +4752,6 @@
             <w:r>
               <w:rPr>
                 <w:rFonts w:ascii="Calibri" w:eastAsia="Calibri" w:hAnsi="Calibri" w:cs="Calibri"/>
-                <w:strike/>
                 <w:color w:val="1A1A2E"/>
                 <w:sz w:val="17"/>
                 <w:szCs w:val="17"/>
@@ -5015,7 +4783,6 @@
           <w:p>
             <w:pPr>
               <w:rPr>
-                <w:strike/>
                 <w:lang w:val="es-NI"/>
               </w:rPr>
             </w:pPr>
@@ -5041,7 +4808,6 @@
           <w:p>
             <w:pPr>
               <w:rPr>
-                <w:strike/>
                 <w:lang w:val="es-NI"/>
               </w:rPr>
             </w:pPr>
@@ -5067,7 +4833,6 @@
           <w:p>
             <w:pPr>
               <w:rPr>
-                <w:strike/>
                 <w:lang w:val="es-NI"/>
               </w:rPr>
             </w:pPr>
@@ -5093,16 +4858,14 @@
           <w:p>
             <w:pPr>
               <w:rPr>
-                <w:strike/>
-                <w:lang w:val="es-NI"/>
-              </w:rPr>
-            </w:pPr>
-            <w:r>
-              <w:rPr>
-                <w:rFonts w:ascii="Calibri" w:eastAsia="Calibri" w:hAnsi="Calibri" w:cs="Calibri"/>
-                <w:b/>
-                <w:bCs/>
-                <w:strike/>
+                <w:lang w:val="es-NI"/>
+              </w:rPr>
+            </w:pPr>
+            <w:r>
+              <w:rPr>
+                <w:rFonts w:ascii="Calibri" w:eastAsia="Calibri" w:hAnsi="Calibri" w:cs="Calibri"/>
+                <w:b/>
+                <w:bCs/>
                 <w:color w:val="0E7FD4"/>
                 <w:sz w:val="17"/>
                 <w:szCs w:val="17"/>
@@ -5113,7 +4876,6 @@
             <w:r>
               <w:rPr>
                 <w:rFonts w:ascii="Calibri" w:eastAsia="Calibri" w:hAnsi="Calibri" w:cs="Calibri"/>
-                <w:strike/>
                 <w:color w:val="1A1A2E"/>
                 <w:sz w:val="17"/>
                 <w:szCs w:val="17"/>
@@ -5753,17 +5515,11 @@
             </w:tcMar>
           </w:tcPr>
           <w:p>
-            <w:pPr>
-              <w:rPr>
-                <w:strike/>
-              </w:rPr>
-            </w:pPr>
-            <w:r>
-              <w:rPr>
-                <w:rFonts w:ascii="Calibri" w:eastAsia="Calibri" w:hAnsi="Calibri" w:cs="Calibri"/>
-                <w:b/>
-                <w:bCs/>
-                <w:strike/>
+            <w:r>
+              <w:rPr>
+                <w:rFonts w:ascii="Calibri" w:eastAsia="Calibri" w:hAnsi="Calibri" w:cs="Calibri"/>
+                <w:b/>
+                <w:bCs/>
                 <w:color w:val="0A5C9E"/>
                 <w:sz w:val="16"/>
                 <w:szCs w:val="16"/>
@@ -5775,7 +5531,6 @@
                 <w:rFonts w:ascii="Calibri" w:eastAsia="Calibri" w:hAnsi="Calibri" w:cs="Calibri"/>
                 <w:b/>
                 <w:bCs/>
-                <w:strike/>
                 <w:color w:val="0A5C9E"/>
                 <w:sz w:val="16"/>
                 <w:szCs w:val="16"/>
@@ -5804,9 +5559,6 @@
           <w:p>
             <w:pPr>
               <w:jc w:val="center"/>
-              <w:rPr>
-                <w:strike/>
-              </w:rPr>
             </w:pPr>
             <w:proofErr w:type="spellStart"/>
             <w:r>
@@ -5814,7 +5566,6 @@
                 <w:rFonts w:ascii="Calibri" w:eastAsia="Calibri" w:hAnsi="Calibri" w:cs="Calibri"/>
                 <w:b/>
                 <w:bCs/>
-                <w:strike/>
                 <w:color w:val="D35400"/>
                 <w:sz w:val="15"/>
                 <w:szCs w:val="15"/>
@@ -5844,16 +5595,14 @@
           <w:p>
             <w:pPr>
               <w:rPr>
-                <w:strike/>
-                <w:lang w:val="es-NI"/>
-              </w:rPr>
-            </w:pPr>
-            <w:r>
-              <w:rPr>
-                <w:rFonts w:ascii="Calibri" w:eastAsia="Calibri" w:hAnsi="Calibri" w:cs="Calibri"/>
-                <w:b/>
-                <w:bCs/>
-                <w:strike/>
+                <w:lang w:val="es-NI"/>
+              </w:rPr>
+            </w:pPr>
+            <w:r>
+              <w:rPr>
+                <w:rFonts w:ascii="Calibri" w:eastAsia="Calibri" w:hAnsi="Calibri" w:cs="Calibri"/>
+                <w:b/>
+                <w:bCs/>
                 <w:color w:val="1B2B4B"/>
                 <w:sz w:val="17"/>
                 <w:szCs w:val="17"/>
@@ -5883,14 +5632,12 @@
           <w:p>
             <w:pPr>
               <w:rPr>
-                <w:strike/>
-                <w:lang w:val="es-NI"/>
-              </w:rPr>
-            </w:pPr>
-            <w:r>
-              <w:rPr>
-                <w:rFonts w:ascii="Calibri" w:eastAsia="Calibri" w:hAnsi="Calibri" w:cs="Calibri"/>
-                <w:strike/>
+                <w:lang w:val="es-NI"/>
+              </w:rPr>
+            </w:pPr>
+            <w:r>
+              <w:rPr>
+                <w:rFonts w:ascii="Calibri" w:eastAsia="Calibri" w:hAnsi="Calibri" w:cs="Calibri"/>
                 <w:color w:val="1A1A2E"/>
                 <w:sz w:val="17"/>
                 <w:szCs w:val="17"/>
@@ -5922,7 +5669,6 @@
           <w:p>
             <w:pPr>
               <w:rPr>
-                <w:strike/>
                 <w:lang w:val="es-NI"/>
               </w:rPr>
             </w:pPr>
@@ -5948,7 +5694,6 @@
           <w:p>
             <w:pPr>
               <w:rPr>
-                <w:strike/>
                 <w:lang w:val="es-NI"/>
               </w:rPr>
             </w:pPr>
@@ -5974,7 +5719,6 @@
           <w:p>
             <w:pPr>
               <w:rPr>
-                <w:strike/>
                 <w:lang w:val="es-NI"/>
               </w:rPr>
             </w:pPr>
@@ -6000,16 +5744,14 @@
           <w:p>
             <w:pPr>
               <w:rPr>
-                <w:strike/>
-                <w:lang w:val="es-NI"/>
-              </w:rPr>
-            </w:pPr>
-            <w:r>
-              <w:rPr>
-                <w:rFonts w:ascii="Calibri" w:eastAsia="Calibri" w:hAnsi="Calibri" w:cs="Calibri"/>
-                <w:b/>
-                <w:bCs/>
-                <w:strike/>
+                <w:lang w:val="es-NI"/>
+              </w:rPr>
+            </w:pPr>
+            <w:r>
+              <w:rPr>
+                <w:rFonts w:ascii="Calibri" w:eastAsia="Calibri" w:hAnsi="Calibri" w:cs="Calibri"/>
+                <w:b/>
+                <w:bCs/>
                 <w:color w:val="0E7FD4"/>
                 <w:sz w:val="17"/>
                 <w:szCs w:val="17"/>
@@ -6020,7 +5762,6 @@
             <w:r>
               <w:rPr>
                 <w:rFonts w:ascii="Calibri" w:eastAsia="Calibri" w:hAnsi="Calibri" w:cs="Calibri"/>
-                <w:strike/>
                 <w:color w:val="1A1A2E"/>
                 <w:sz w:val="17"/>
                 <w:szCs w:val="17"/>
@@ -6052,7 +5793,6 @@
           <w:p>
             <w:pPr>
               <w:rPr>
-                <w:strike/>
                 <w:lang w:val="es-NI"/>
               </w:rPr>
             </w:pPr>
@@ -6078,7 +5818,6 @@
           <w:p>
             <w:pPr>
               <w:rPr>
-                <w:strike/>
                 <w:lang w:val="es-NI"/>
               </w:rPr>
             </w:pPr>
@@ -6104,7 +5843,6 @@
           <w:p>
             <w:pPr>
               <w:rPr>
-                <w:strike/>
                 <w:lang w:val="es-NI"/>
               </w:rPr>
             </w:pPr>
@@ -6130,16 +5868,14 @@
           <w:p>
             <w:pPr>
               <w:rPr>
-                <w:strike/>
-                <w:lang w:val="es-NI"/>
-              </w:rPr>
-            </w:pPr>
-            <w:r>
-              <w:rPr>
-                <w:rFonts w:ascii="Calibri" w:eastAsia="Calibri" w:hAnsi="Calibri" w:cs="Calibri"/>
-                <w:b/>
-                <w:bCs/>
-                <w:strike/>
+                <w:lang w:val="es-NI"/>
+              </w:rPr>
+            </w:pPr>
+            <w:r>
+              <w:rPr>
+                <w:rFonts w:ascii="Calibri" w:eastAsia="Calibri" w:hAnsi="Calibri" w:cs="Calibri"/>
+                <w:b/>
+                <w:bCs/>
                 <w:color w:val="0E7FD4"/>
                 <w:sz w:val="17"/>
                 <w:szCs w:val="17"/>
@@ -6150,7 +5886,6 @@
             <w:r>
               <w:rPr>
                 <w:rFonts w:ascii="Calibri" w:eastAsia="Calibri" w:hAnsi="Calibri" w:cs="Calibri"/>
-                <w:strike/>
                 <w:color w:val="1A1A2E"/>
                 <w:sz w:val="17"/>
                 <w:szCs w:val="17"/>
@@ -6182,7 +5917,6 @@
           <w:p>
             <w:pPr>
               <w:rPr>
-                <w:strike/>
                 <w:lang w:val="es-NI"/>
               </w:rPr>
             </w:pPr>
@@ -6208,7 +5942,6 @@
           <w:p>
             <w:pPr>
               <w:rPr>
-                <w:strike/>
                 <w:lang w:val="es-NI"/>
               </w:rPr>
             </w:pPr>
@@ -6234,7 +5967,6 @@
           <w:p>
             <w:pPr>
               <w:rPr>
-                <w:strike/>
                 <w:lang w:val="es-NI"/>
               </w:rPr>
             </w:pPr>
@@ -6260,16 +5992,14 @@
           <w:p>
             <w:pPr>
               <w:rPr>
-                <w:strike/>
-                <w:lang w:val="es-NI"/>
-              </w:rPr>
-            </w:pPr>
-            <w:r>
-              <w:rPr>
-                <w:rFonts w:ascii="Calibri" w:eastAsia="Calibri" w:hAnsi="Calibri" w:cs="Calibri"/>
-                <w:b/>
-                <w:bCs/>
-                <w:strike/>
+                <w:lang w:val="es-NI"/>
+              </w:rPr>
+            </w:pPr>
+            <w:r>
+              <w:rPr>
+                <w:rFonts w:ascii="Calibri" w:eastAsia="Calibri" w:hAnsi="Calibri" w:cs="Calibri"/>
+                <w:b/>
+                <w:bCs/>
                 <w:color w:val="0E7FD4"/>
                 <w:sz w:val="17"/>
                 <w:szCs w:val="17"/>
@@ -6280,7 +6010,6 @@
             <w:r>
               <w:rPr>
                 <w:rFonts w:ascii="Calibri" w:eastAsia="Calibri" w:hAnsi="Calibri" w:cs="Calibri"/>
-                <w:strike/>
                 <w:color w:val="1A1A2E"/>
                 <w:sz w:val="17"/>
                 <w:szCs w:val="17"/>
@@ -6312,7 +6041,6 @@
           <w:p>
             <w:pPr>
               <w:rPr>
-                <w:strike/>
                 <w:lang w:val="es-NI"/>
               </w:rPr>
             </w:pPr>
@@ -6338,7 +6066,6 @@
           <w:p>
             <w:pPr>
               <w:rPr>
-                <w:strike/>
                 <w:lang w:val="es-NI"/>
               </w:rPr>
             </w:pPr>
@@ -6364,7 +6091,6 @@
           <w:p>
             <w:pPr>
               <w:rPr>
-                <w:strike/>
                 <w:lang w:val="es-NI"/>
               </w:rPr>
             </w:pPr>
@@ -6390,16 +6116,14 @@
           <w:p>
             <w:pPr>
               <w:rPr>
-                <w:strike/>
-                <w:lang w:val="es-NI"/>
-              </w:rPr>
-            </w:pPr>
-            <w:r>
-              <w:rPr>
-                <w:rFonts w:ascii="Calibri" w:eastAsia="Calibri" w:hAnsi="Calibri" w:cs="Calibri"/>
-                <w:b/>
-                <w:bCs/>
-                <w:strike/>
+                <w:lang w:val="es-NI"/>
+              </w:rPr>
+            </w:pPr>
+            <w:r>
+              <w:rPr>
+                <w:rFonts w:ascii="Calibri" w:eastAsia="Calibri" w:hAnsi="Calibri" w:cs="Calibri"/>
+                <w:b/>
+                <w:bCs/>
                 <w:color w:val="0E7FD4"/>
                 <w:sz w:val="17"/>
                 <w:szCs w:val="17"/>
@@ -6410,7 +6134,6 @@
             <w:r>
               <w:rPr>
                 <w:rFonts w:ascii="Calibri" w:eastAsia="Calibri" w:hAnsi="Calibri" w:cs="Calibri"/>
-                <w:strike/>
                 <w:color w:val="1A1A2E"/>
                 <w:sz w:val="17"/>
                 <w:szCs w:val="17"/>
@@ -7372,19 +7095,7 @@
                 <w:szCs w:val="17"/>
                 <w:lang w:val="es-NI"/>
               </w:rPr>
-              <w:t>1</w:t>
-            </w:r>
-            <w:r>
-              <w:rPr>
-                <w:rFonts w:ascii="Calibri" w:eastAsia="Calibri" w:hAnsi="Calibri" w:cs="Calibri"/>
-                <w:b/>
-                <w:bCs/>
-                <w:color w:val="0E7FD4"/>
-                <w:sz w:val="17"/>
-                <w:szCs w:val="17"/>
-                <w:lang w:val="es-NI"/>
-              </w:rPr>
-              <w:t xml:space="preserve">. </w:t>
+              <w:t xml:space="preserve">1. </w:t>
             </w:r>
             <w:r>
               <w:rPr>
@@ -7394,7 +7105,29 @@
                 <w:szCs w:val="17"/>
                 <w:lang w:val="es-NI"/>
               </w:rPr>
-              <w:t>Los movimientos de reclamos deben reflejarse en caja con trazabilidad al origen.</w:t>
+              <w:t xml:space="preserve">Los movimientos de reclamos deben reflejarse en </w:t>
+            </w:r>
+            <w:proofErr w:type="gramStart"/>
+            <w:r>
+              <w:rPr>
+                <w:rFonts w:ascii="Calibri" w:eastAsia="Calibri" w:hAnsi="Calibri" w:cs="Calibri"/>
+                <w:color w:val="1A1A2E"/>
+                <w:sz w:val="17"/>
+                <w:szCs w:val="17"/>
+                <w:lang w:val="es-NI"/>
+              </w:rPr>
+              <w:t>caja</w:t>
+            </w:r>
+            <w:proofErr w:type="gramEnd"/>
+            <w:r>
+              <w:rPr>
+                <w:rFonts w:ascii="Calibri" w:eastAsia="Calibri" w:hAnsi="Calibri" w:cs="Calibri"/>
+                <w:color w:val="1A1A2E"/>
+                <w:sz w:val="17"/>
+                <w:szCs w:val="17"/>
+                <w:lang w:val="es-NI"/>
+              </w:rPr>
+              <w:t xml:space="preserve"> con trazabilidad al origen.</w:t>
             </w:r>
           </w:p>
         </w:tc>
@@ -7508,19 +7241,7 @@
                 <w:szCs w:val="17"/>
                 <w:lang w:val="es-NI"/>
               </w:rPr>
-              <w:t>2</w:t>
-            </w:r>
-            <w:r>
-              <w:rPr>
-                <w:rFonts w:ascii="Calibri" w:eastAsia="Calibri" w:hAnsi="Calibri" w:cs="Calibri"/>
-                <w:b/>
-                <w:bCs/>
-                <w:color w:val="0E7FD4"/>
-                <w:sz w:val="17"/>
-                <w:szCs w:val="17"/>
-                <w:lang w:val="es-NI"/>
-              </w:rPr>
-              <w:t xml:space="preserve">. </w:t>
+              <w:t xml:space="preserve">2. </w:t>
             </w:r>
             <w:r>
               <w:rPr>
@@ -7598,17 +7319,11 @@
             </w:tcMar>
           </w:tcPr>
           <w:p>
-            <w:pPr>
-              <w:rPr>
-                <w:strike/>
-              </w:rPr>
-            </w:pPr>
-            <w:r>
-              <w:rPr>
-                <w:rFonts w:ascii="Calibri" w:eastAsia="Calibri" w:hAnsi="Calibri" w:cs="Calibri"/>
-                <w:b/>
-                <w:bCs/>
-                <w:strike/>
+            <w:r>
+              <w:rPr>
+                <w:rFonts w:ascii="Calibri" w:eastAsia="Calibri" w:hAnsi="Calibri" w:cs="Calibri"/>
+                <w:b/>
+                <w:bCs/>
                 <w:color w:val="0A5C9E"/>
                 <w:sz w:val="16"/>
                 <w:szCs w:val="16"/>
@@ -7620,7 +7335,6 @@
                 <w:rFonts w:ascii="Calibri" w:eastAsia="Calibri" w:hAnsi="Calibri" w:cs="Calibri"/>
                 <w:b/>
                 <w:bCs/>
-                <w:strike/>
                 <w:color w:val="0A5C9E"/>
                 <w:sz w:val="16"/>
                 <w:szCs w:val="16"/>
@@ -7649,16 +7363,12 @@
           <w:p>
             <w:pPr>
               <w:jc w:val="center"/>
-              <w:rPr>
-                <w:strike/>
-              </w:rPr>
-            </w:pPr>
-            <w:r>
-              <w:rPr>
-                <w:rFonts w:ascii="Calibri" w:eastAsia="Calibri" w:hAnsi="Calibri" w:cs="Calibri"/>
-                <w:b/>
-                <w:bCs/>
-                <w:strike/>
+            </w:pPr>
+            <w:r>
+              <w:rPr>
+                <w:rFonts w:ascii="Calibri" w:eastAsia="Calibri" w:hAnsi="Calibri" w:cs="Calibri"/>
+                <w:b/>
+                <w:bCs/>
                 <w:color w:val="C0392B"/>
                 <w:sz w:val="15"/>
                 <w:szCs w:val="15"/>
@@ -7685,18 +7395,12 @@
             </w:tcMar>
           </w:tcPr>
           <w:p>
-            <w:pPr>
-              <w:rPr>
-                <w:strike/>
-              </w:rPr>
-            </w:pPr>
             <w:proofErr w:type="spellStart"/>
             <w:r>
               <w:rPr>
                 <w:rFonts w:ascii="Calibri" w:eastAsia="Calibri" w:hAnsi="Calibri" w:cs="Calibri"/>
                 <w:b/>
                 <w:bCs/>
-                <w:strike/>
                 <w:color w:val="1B2B4B"/>
                 <w:sz w:val="17"/>
                 <w:szCs w:val="17"/>
@@ -7709,7 +7413,6 @@
                 <w:rFonts w:ascii="Calibri" w:eastAsia="Calibri" w:hAnsi="Calibri" w:cs="Calibri"/>
                 <w:b/>
                 <w:bCs/>
-                <w:strike/>
                 <w:color w:val="1B2B4B"/>
                 <w:sz w:val="17"/>
                 <w:szCs w:val="17"/>
@@ -7722,7 +7425,6 @@
                 <w:rFonts w:ascii="Calibri" w:eastAsia="Calibri" w:hAnsi="Calibri" w:cs="Calibri"/>
                 <w:b/>
                 <w:bCs/>
-                <w:strike/>
                 <w:color w:val="1B2B4B"/>
                 <w:sz w:val="17"/>
                 <w:szCs w:val="17"/>
@@ -7735,7 +7437,6 @@
                 <w:rFonts w:ascii="Calibri" w:eastAsia="Calibri" w:hAnsi="Calibri" w:cs="Calibri"/>
                 <w:b/>
                 <w:bCs/>
-                <w:strike/>
                 <w:color w:val="1B2B4B"/>
                 <w:sz w:val="17"/>
                 <w:szCs w:val="17"/>
@@ -7748,7 +7449,6 @@
                 <w:rFonts w:ascii="Calibri" w:eastAsia="Calibri" w:hAnsi="Calibri" w:cs="Calibri"/>
                 <w:b/>
                 <w:bCs/>
-                <w:strike/>
                 <w:color w:val="1B2B4B"/>
                 <w:sz w:val="17"/>
                 <w:szCs w:val="17"/>
@@ -7778,14 +7478,12 @@
           <w:p>
             <w:pPr>
               <w:rPr>
-                <w:strike/>
-                <w:lang w:val="es-NI"/>
-              </w:rPr>
-            </w:pPr>
-            <w:r>
-              <w:rPr>
-                <w:rFonts w:ascii="Calibri" w:eastAsia="Calibri" w:hAnsi="Calibri" w:cs="Calibri"/>
-                <w:strike/>
+                <w:lang w:val="es-NI"/>
+              </w:rPr>
+            </w:pPr>
+            <w:r>
+              <w:rPr>
+                <w:rFonts w:ascii="Calibri" w:eastAsia="Calibri" w:hAnsi="Calibri" w:cs="Calibri"/>
                 <w:color w:val="1A1A2E"/>
                 <w:sz w:val="17"/>
                 <w:szCs w:val="17"/>
@@ -7817,7 +7515,6 @@
           <w:p>
             <w:pPr>
               <w:rPr>
-                <w:strike/>
                 <w:lang w:val="es-NI"/>
               </w:rPr>
             </w:pPr>
@@ -7843,7 +7540,6 @@
           <w:p>
             <w:pPr>
               <w:rPr>
-                <w:strike/>
                 <w:lang w:val="es-NI"/>
               </w:rPr>
             </w:pPr>
@@ -7869,7 +7565,6 @@
           <w:p>
             <w:pPr>
               <w:rPr>
-                <w:strike/>
                 <w:lang w:val="es-NI"/>
               </w:rPr>
             </w:pPr>
@@ -7895,16 +7590,14 @@
           <w:p>
             <w:pPr>
               <w:rPr>
-                <w:strike/>
-                <w:lang w:val="es-NI"/>
-              </w:rPr>
-            </w:pPr>
-            <w:r>
-              <w:rPr>
-                <w:rFonts w:ascii="Calibri" w:eastAsia="Calibri" w:hAnsi="Calibri" w:cs="Calibri"/>
-                <w:b/>
-                <w:bCs/>
-                <w:strike/>
+                <w:lang w:val="es-NI"/>
+              </w:rPr>
+            </w:pPr>
+            <w:r>
+              <w:rPr>
+                <w:rFonts w:ascii="Calibri" w:eastAsia="Calibri" w:hAnsi="Calibri" w:cs="Calibri"/>
+                <w:b/>
+                <w:bCs/>
                 <w:color w:val="0E7FD4"/>
                 <w:sz w:val="17"/>
                 <w:szCs w:val="17"/>
@@ -7915,7 +7608,6 @@
             <w:r>
               <w:rPr>
                 <w:rFonts w:ascii="Calibri" w:eastAsia="Calibri" w:hAnsi="Calibri" w:cs="Calibri"/>
-                <w:strike/>
                 <w:color w:val="1A1A2E"/>
                 <w:sz w:val="17"/>
                 <w:szCs w:val="17"/>
@@ -7926,7 +7618,6 @@
             <w:r>
               <w:rPr>
                 <w:rFonts w:ascii="Calibri" w:eastAsia="Calibri" w:hAnsi="Calibri" w:cs="Calibri"/>
-                <w:strike/>
                 <w:color w:val="1A1A2E"/>
                 <w:sz w:val="17"/>
                 <w:szCs w:val="17"/>
@@ -7937,7 +7628,6 @@
             <w:r>
               <w:rPr>
                 <w:rFonts w:ascii="Calibri" w:eastAsia="Calibri" w:hAnsi="Calibri" w:cs="Calibri"/>
-                <w:strike/>
                 <w:color w:val="1A1A2E"/>
                 <w:sz w:val="17"/>
                 <w:szCs w:val="17"/>
@@ -7948,7 +7638,6 @@
             <w:r>
               <w:rPr>
                 <w:rFonts w:ascii="Calibri" w:eastAsia="Calibri" w:hAnsi="Calibri" w:cs="Calibri"/>
-                <w:strike/>
                 <w:color w:val="1A1A2E"/>
                 <w:sz w:val="17"/>
                 <w:szCs w:val="17"/>
@@ -7959,7 +7648,6 @@
             <w:r>
               <w:rPr>
                 <w:rFonts w:ascii="Calibri" w:eastAsia="Calibri" w:hAnsi="Calibri" w:cs="Calibri"/>
-                <w:strike/>
                 <w:color w:val="1A1A2E"/>
                 <w:sz w:val="17"/>
                 <w:szCs w:val="17"/>
@@ -7991,7 +7679,6 @@
           <w:p>
             <w:pPr>
               <w:rPr>
-                <w:strike/>
                 <w:lang w:val="es-NI"/>
               </w:rPr>
             </w:pPr>
@@ -8017,7 +7704,6 @@
           <w:p>
             <w:pPr>
               <w:rPr>
-                <w:strike/>
                 <w:lang w:val="es-NI"/>
               </w:rPr>
             </w:pPr>
@@ -8043,7 +7729,6 @@
           <w:p>
             <w:pPr>
               <w:rPr>
-                <w:strike/>
                 <w:lang w:val="es-NI"/>
               </w:rPr>
             </w:pPr>
@@ -8069,16 +7754,14 @@
           <w:p>
             <w:pPr>
               <w:rPr>
-                <w:strike/>
-                <w:lang w:val="es-NI"/>
-              </w:rPr>
-            </w:pPr>
-            <w:r>
-              <w:rPr>
-                <w:rFonts w:ascii="Calibri" w:eastAsia="Calibri" w:hAnsi="Calibri" w:cs="Calibri"/>
-                <w:b/>
-                <w:bCs/>
-                <w:strike/>
+                <w:lang w:val="es-NI"/>
+              </w:rPr>
+            </w:pPr>
+            <w:r>
+              <w:rPr>
+                <w:rFonts w:ascii="Calibri" w:eastAsia="Calibri" w:hAnsi="Calibri" w:cs="Calibri"/>
+                <w:b/>
+                <w:bCs/>
                 <w:color w:val="0E7FD4"/>
                 <w:sz w:val="17"/>
                 <w:szCs w:val="17"/>
@@ -8089,7 +7772,6 @@
             <w:r>
               <w:rPr>
                 <w:rFonts w:ascii="Calibri" w:eastAsia="Calibri" w:hAnsi="Calibri" w:cs="Calibri"/>
-                <w:strike/>
                 <w:color w:val="1A1A2E"/>
                 <w:sz w:val="17"/>
                 <w:szCs w:val="17"/>
@@ -8121,7 +7803,6 @@
           <w:p>
             <w:pPr>
               <w:rPr>
-                <w:strike/>
                 <w:lang w:val="es-NI"/>
               </w:rPr>
             </w:pPr>
@@ -8147,7 +7828,6 @@
           <w:p>
             <w:pPr>
               <w:rPr>
-                <w:strike/>
                 <w:lang w:val="es-NI"/>
               </w:rPr>
             </w:pPr>
@@ -8173,7 +7853,6 @@
           <w:p>
             <w:pPr>
               <w:rPr>
-                <w:strike/>
                 <w:lang w:val="es-NI"/>
               </w:rPr>
             </w:pPr>
@@ -8199,16 +7878,14 @@
           <w:p>
             <w:pPr>
               <w:rPr>
-                <w:strike/>
-                <w:lang w:val="es-NI"/>
-              </w:rPr>
-            </w:pPr>
-            <w:r>
-              <w:rPr>
-                <w:rFonts w:ascii="Calibri" w:eastAsia="Calibri" w:hAnsi="Calibri" w:cs="Calibri"/>
-                <w:b/>
-                <w:bCs/>
-                <w:strike/>
+                <w:lang w:val="es-NI"/>
+              </w:rPr>
+            </w:pPr>
+            <w:r>
+              <w:rPr>
+                <w:rFonts w:ascii="Calibri" w:eastAsia="Calibri" w:hAnsi="Calibri" w:cs="Calibri"/>
+                <w:b/>
+                <w:bCs/>
                 <w:color w:val="0E7FD4"/>
                 <w:sz w:val="17"/>
                 <w:szCs w:val="17"/>
@@ -8219,7 +7896,6 @@
             <w:r>
               <w:rPr>
                 <w:rFonts w:ascii="Calibri" w:eastAsia="Calibri" w:hAnsi="Calibri" w:cs="Calibri"/>
-                <w:strike/>
                 <w:color w:val="1A1A2E"/>
                 <w:sz w:val="17"/>
                 <w:szCs w:val="17"/>
@@ -24593,19 +24269,7 @@
                 <w:szCs w:val="17"/>
                 <w:lang w:val="es-NI"/>
               </w:rPr>
-              <w:t>2</w:t>
-            </w:r>
-            <w:r>
-              <w:rPr>
-                <w:rFonts w:ascii="Calibri" w:eastAsia="Calibri" w:hAnsi="Calibri" w:cs="Calibri"/>
-                <w:b/>
-                <w:bCs/>
-                <w:color w:val="0E7FD4"/>
-                <w:sz w:val="17"/>
-                <w:szCs w:val="17"/>
-                <w:lang w:val="es-NI"/>
-              </w:rPr>
-              <w:t xml:space="preserve">. </w:t>
+              <w:t xml:space="preserve">2. </w:t>
             </w:r>
             <w:r>
               <w:rPr>
@@ -35977,6 +35641,653 @@
         </w:rPr>
       </w:pPr>
     </w:p>
+    <w:p>
+      <w:pPr>
+        <w:pBdr>
+          <w:bottom w:val="single" w:sz="6" w:space="0" w:color="0E7FD4"/>
+        </w:pBdr>
+        <w:spacing w:before="360" w:after="120"/>
+      </w:pPr>
+      <w:r>
+        <w:rPr>
+          <w:rFonts w:ascii="Calibri" w:hAnsi="Calibri" w:cs="Calibri"/>
+          <w:b/>
+          <w:color w:val="1B2B4B"/>
+          <w:sz w:val="26"/>
+        </w:rPr>
+        <w:t>Anexo 1</w:t>
+      </w:r>
+      <w:r>
+        <w:rPr>
+          <w:rFonts w:ascii="Calibri" w:hAnsi="Calibri" w:cs="Calibri"/>
+          <w:b/>
+          <w:color w:val="1B2B4B"/>
+          <w:sz w:val="26"/>
+        </w:rPr>
+        <w:t xml:space="preserve"> (2026-09-16)</w:t>
+      </w:r>
+    </w:p>
+    <w:tbl>
+      <w:tblPr>
+        <w:tblW w:w="0" w:type="auto"/>
+        <w:tblLayout w:type="fixed"/>
+        <w:tblLook w:val="04A0" w:firstRow="1" w:lastRow="0" w:firstColumn="1" w:lastColumn="0" w:noHBand="0" w:noVBand="1"/>
+      </w:tblPr>
+      <w:tblGrid>
+        <w:gridCol w:w="1134"/>
+        <w:gridCol w:w="284"/>
+        <w:gridCol w:w="1701"/>
+        <w:gridCol w:w="7321"/>
+      </w:tblGrid>
+      <w:tr>
+        <w:tc>
+          <w:tcPr>
+            <w:tcW w:w="1134" w:type="dxa"/>
+          </w:tcPr>
+          <w:p>
+            <w:r>
+              <w:rPr>
+                <w:rFonts w:ascii="Calibri" w:hAnsi="Calibri" w:cs="Calibri"/>
+                <w:b/>
+                <w:color w:val="FFFFFF"/>
+                <w:sz w:val="16"/>
+              </w:rPr>
+              <w:t>ID</w:t>
+            </w:r>
+          </w:p>
+        </w:tc>
+        <w:tc>
+          <w:tcPr>
+            <w:tcW w:w="284" w:type="dxa"/>
+          </w:tcPr>
+          <w:p>
+            <w:pPr>
+              <w:jc w:val="center"/>
+            </w:pPr>
+            <w:r>
+              <w:rPr>
+                <w:rFonts w:ascii="Calibri" w:hAnsi="Calibri" w:cs="Calibri"/>
+                <w:b/>
+                <w:color w:val="FFFFFF"/>
+                <w:sz w:val="16"/>
+              </w:rPr>
+              <w:t>Estado</w:t>
+            </w:r>
+          </w:p>
+        </w:tc>
+        <w:tc>
+          <w:tcPr>
+            <w:tcW w:w="1701" w:type="dxa"/>
+          </w:tcPr>
+          <w:p>
+            <w:proofErr w:type="spellStart"/>
+            <w:r>
+              <w:rPr>
+                <w:rFonts w:ascii="Calibri" w:hAnsi="Calibri" w:cs="Calibri"/>
+                <w:b/>
+                <w:color w:val="FFFFFF"/>
+                <w:sz w:val="16"/>
+              </w:rPr>
+              <w:t>Funcionalidad</w:t>
+            </w:r>
+            <w:proofErr w:type="spellEnd"/>
+          </w:p>
+        </w:tc>
+        <w:tc>
+          <w:tcPr>
+            <w:tcW w:w="7321" w:type="dxa"/>
+          </w:tcPr>
+          <w:p>
+            <w:pPr>
+              <w:rPr>
+                <w:lang w:val="es-NI"/>
+              </w:rPr>
+            </w:pPr>
+            <w:r>
+              <w:rPr>
+                <w:rFonts w:ascii="Calibri" w:hAnsi="Calibri" w:cs="Calibri"/>
+                <w:b/>
+                <w:color w:val="FFFFFF"/>
+                <w:sz w:val="16"/>
+                <w:lang w:val="es-NI"/>
+              </w:rPr>
+              <w:t>Criterio de aceptación + Condiciones de validación</w:t>
+            </w:r>
+          </w:p>
+        </w:tc>
+      </w:tr>
+      <w:tr>
+        <w:tc>
+          <w:tcPr>
+            <w:tcW w:w="1134" w:type="dxa"/>
+          </w:tcPr>
+          <w:p>
+            <w:r>
+              <w:rPr>
+                <w:rFonts w:ascii="Calibri" w:hAnsi="Calibri" w:cs="Calibri"/>
+                <w:b/>
+                <w:color w:val="0A5C9E"/>
+                <w:sz w:val="16"/>
+              </w:rPr>
+              <w:t>CA-</w:t>
+            </w:r>
+            <w:r>
+              <w:rPr>
+                <w:rFonts w:ascii="Calibri" w:hAnsi="Calibri" w:cs="Calibri"/>
+                <w:b/>
+                <w:color w:val="0A5C9E"/>
+                <w:sz w:val="16"/>
+              </w:rPr>
+              <w:t>AP1</w:t>
+            </w:r>
+            <w:r>
+              <w:rPr>
+                <w:rFonts w:ascii="Calibri" w:hAnsi="Calibri" w:cs="Calibri"/>
+                <w:b/>
+                <w:color w:val="0A5C9E"/>
+                <w:sz w:val="16"/>
+              </w:rPr>
+              <w:t>-D01</w:t>
+            </w:r>
+          </w:p>
+        </w:tc>
+        <w:tc>
+          <w:tcPr>
+            <w:tcW w:w="284" w:type="dxa"/>
+          </w:tcPr>
+          <w:p>
+            <w:pPr>
+              <w:jc w:val="center"/>
+            </w:pPr>
+            <w:r>
+              <w:rPr>
+                <w:rFonts w:ascii="Calibri" w:hAnsi="Calibri" w:cs="Calibri"/>
+                <w:b/>
+                <w:color w:val="C0392B"/>
+                <w:sz w:val="15"/>
+              </w:rPr>
+              <w:t>No Exi</w:t>
+            </w:r>
+            <w:r>
+              <w:rPr>
+                <w:rFonts w:ascii="Calibri" w:hAnsi="Calibri" w:cs="Calibri"/>
+                <w:b/>
+                <w:color w:val="C0392B"/>
+                <w:sz w:val="15"/>
+              </w:rPr>
+              <w:lastRenderedPageBreak/>
+              <w:t>ste</w:t>
+            </w:r>
+          </w:p>
+        </w:tc>
+        <w:tc>
+          <w:tcPr>
+            <w:tcW w:w="1701" w:type="dxa"/>
+          </w:tcPr>
+          <w:p>
+            <w:pPr>
+              <w:rPr>
+                <w:lang w:val="es-NI"/>
+              </w:rPr>
+            </w:pPr>
+            <w:r>
+              <w:rPr>
+                <w:rFonts w:ascii="Calibri" w:hAnsi="Calibri" w:cs="Calibri"/>
+                <w:b/>
+                <w:color w:val="1B2B4B"/>
+                <w:sz w:val="17"/>
+                <w:lang w:val="es-NI"/>
+              </w:rPr>
+              <w:lastRenderedPageBreak/>
+              <w:t>Consolidación de cuentas en tránsito a transacción PPXA</w:t>
+            </w:r>
+            <w:r>
+              <w:rPr>
+                <w:rFonts w:ascii="Calibri" w:hAnsi="Calibri" w:cs="Calibri"/>
+                <w:b/>
+                <w:color w:val="1B2B4B"/>
+                <w:sz w:val="17"/>
+                <w:lang w:val="es-NI"/>
+              </w:rPr>
+              <w:t xml:space="preserve"> y otras funcionalidades</w:t>
+            </w:r>
+          </w:p>
+        </w:tc>
+        <w:tc>
+          <w:tcPr>
+            <w:tcW w:w="7321" w:type="dxa"/>
+          </w:tcPr>
+          <w:p>
+            <w:pPr>
+              <w:rPr>
+                <w:rFonts w:ascii="Calibri" w:hAnsi="Calibri" w:cs="Calibri"/>
+                <w:color w:val="1A1A2E"/>
+                <w:sz w:val="17"/>
+                <w:lang w:val="es-NI"/>
+              </w:rPr>
+            </w:pPr>
+            <w:r>
+              <w:rPr>
+                <w:rFonts w:ascii="Calibri" w:hAnsi="Calibri" w:cs="Calibri"/>
+                <w:color w:val="1A1A2E"/>
+                <w:sz w:val="17"/>
+                <w:lang w:val="es-NI"/>
+              </w:rPr>
+              <w:t xml:space="preserve">SIS11 debe permitir </w:t>
+            </w:r>
+            <w:r>
+              <w:rPr>
+                <w:rFonts w:ascii="Calibri" w:hAnsi="Calibri" w:cs="Calibri"/>
+                <w:color w:val="1A1A2E"/>
+                <w:sz w:val="17"/>
+                <w:lang w:val="es-NI"/>
+              </w:rPr>
+              <w:t xml:space="preserve">aplicar de manera masiva diferentes </w:t>
+            </w:r>
+            <w:r>
+              <w:rPr>
+                <w:rFonts w:ascii="Calibri" w:hAnsi="Calibri" w:cs="Calibri"/>
+                <w:color w:val="1A1A2E"/>
+                <w:sz w:val="17"/>
+                <w:lang w:val="es-NI"/>
+              </w:rPr>
+              <w:t>saldos de cuenta en una sola aplicación usando la transacción de PPXA y enviando a una única cuenta</w:t>
+            </w:r>
+          </w:p>
+          <w:p>
+            <w:pPr>
+              <w:rPr>
+                <w:lang w:val="es-NI"/>
+              </w:rPr>
+            </w:pPr>
+          </w:p>
+          <w:p>
+            <w:pPr>
+              <w:rPr>
+                <w:lang w:val="es-NI"/>
+              </w:rPr>
+            </w:pPr>
+            <w:r>
+              <w:rPr>
+                <w:rFonts w:ascii="Calibri" w:hAnsi="Calibri" w:cs="Calibri"/>
+                <w:b/>
+                <w:color w:val="0E7FD4"/>
+                <w:sz w:val="17"/>
+                <w:lang w:val="es-NI"/>
+              </w:rPr>
+              <w:t xml:space="preserve">1. </w:t>
+            </w:r>
+            <w:r>
+              <w:rPr>
+                <w:rFonts w:ascii="Calibri" w:hAnsi="Calibri" w:cs="Calibri"/>
+                <w:color w:val="1A1A2E"/>
+                <w:sz w:val="17"/>
+                <w:lang w:val="es-NI"/>
+              </w:rPr>
+              <w:t>Sistema debe permitir seleccionar múltiples cuentas de tránsito para aplicación masiva</w:t>
+            </w:r>
+          </w:p>
+          <w:p>
+            <w:pPr>
+              <w:rPr>
+                <w:rFonts w:ascii="Calibri" w:hAnsi="Calibri" w:cs="Calibri"/>
+                <w:color w:val="1A1A2E"/>
+                <w:sz w:val="17"/>
+                <w:lang w:val="es-NI"/>
+              </w:rPr>
+            </w:pPr>
+            <w:r>
+              <w:rPr>
+                <w:rFonts w:ascii="Calibri" w:hAnsi="Calibri" w:cs="Calibri"/>
+                <w:b/>
+                <w:color w:val="0E7FD4"/>
+                <w:sz w:val="17"/>
+                <w:lang w:val="es-NI"/>
+              </w:rPr>
+              <w:lastRenderedPageBreak/>
+              <w:t xml:space="preserve">2. </w:t>
+            </w:r>
+            <w:r>
+              <w:rPr>
+                <w:rFonts w:ascii="Calibri" w:hAnsi="Calibri" w:cs="Calibri"/>
+                <w:color w:val="1A1A2E"/>
+                <w:sz w:val="17"/>
+                <w:lang w:val="es-NI"/>
+              </w:rPr>
+              <w:t>Se deberá crear una cuenta de tránsito para encapsular múltiples saldos de cuentas, se llamará Cuenta PPXA.</w:t>
+            </w:r>
+          </w:p>
+          <w:p>
+            <w:pPr>
+              <w:rPr>
+                <w:rFonts w:ascii="Calibri" w:hAnsi="Calibri" w:cs="Calibri"/>
+                <w:color w:val="1A1A2E"/>
+                <w:sz w:val="17"/>
+                <w:lang w:val="es-NI"/>
+              </w:rPr>
+            </w:pPr>
+            <w:r>
+              <w:rPr>
+                <w:rFonts w:ascii="Calibri" w:hAnsi="Calibri" w:cs="Calibri"/>
+                <w:b/>
+                <w:color w:val="0E7FD4"/>
+                <w:sz w:val="17"/>
+                <w:lang w:val="es-NI"/>
+              </w:rPr>
+              <w:t>3</w:t>
+            </w:r>
+            <w:r>
+              <w:rPr>
+                <w:rFonts w:ascii="Calibri" w:hAnsi="Calibri" w:cs="Calibri"/>
+                <w:b/>
+                <w:color w:val="0E7FD4"/>
+                <w:sz w:val="17"/>
+                <w:lang w:val="es-NI"/>
+              </w:rPr>
+              <w:t xml:space="preserve">. </w:t>
+            </w:r>
+            <w:r>
+              <w:rPr>
+                <w:rFonts w:ascii="Calibri" w:hAnsi="Calibri" w:cs="Calibri"/>
+                <w:color w:val="1A1A2E"/>
+                <w:sz w:val="17"/>
+                <w:lang w:val="es-NI"/>
+              </w:rPr>
+              <w:t>Se deberá habilitar la opción de exportar los resultados de la búsqueda de cuentas a Excel, tanto información resumida como detalle de movimientos</w:t>
+            </w:r>
+            <w:r>
+              <w:rPr>
+                <w:rFonts w:ascii="Calibri" w:hAnsi="Calibri" w:cs="Calibri"/>
+                <w:color w:val="1A1A2E"/>
+                <w:sz w:val="17"/>
+                <w:lang w:val="es-NI"/>
+              </w:rPr>
+              <w:t>.</w:t>
+            </w:r>
+          </w:p>
+          <w:p>
+            <w:pPr>
+              <w:rPr>
+                <w:rFonts w:ascii="Calibri" w:hAnsi="Calibri" w:cs="Calibri"/>
+                <w:color w:val="1A1A2E"/>
+                <w:sz w:val="17"/>
+                <w:lang w:val="es-NI"/>
+              </w:rPr>
+            </w:pPr>
+            <w:r>
+              <w:rPr>
+                <w:rFonts w:ascii="Calibri" w:hAnsi="Calibri" w:cs="Calibri"/>
+                <w:b/>
+                <w:color w:val="0E7FD4"/>
+                <w:sz w:val="17"/>
+                <w:lang w:val="es-NI"/>
+              </w:rPr>
+              <w:t>4</w:t>
+            </w:r>
+            <w:r>
+              <w:rPr>
+                <w:rFonts w:ascii="Calibri" w:hAnsi="Calibri" w:cs="Calibri"/>
+                <w:b/>
+                <w:color w:val="0E7FD4"/>
+                <w:sz w:val="17"/>
+                <w:lang w:val="es-NI"/>
+              </w:rPr>
+              <w:t xml:space="preserve">. </w:t>
+            </w:r>
+            <w:r>
+              <w:rPr>
+                <w:rFonts w:ascii="Calibri" w:hAnsi="Calibri" w:cs="Calibri"/>
+                <w:color w:val="1A1A2E"/>
+                <w:sz w:val="17"/>
+                <w:lang w:val="es-NI"/>
+              </w:rPr>
+              <w:t>Sistema deberá filtrar únicamente por defecto cuentas con saldos</w:t>
+            </w:r>
+            <w:r>
+              <w:rPr>
+                <w:rFonts w:ascii="Calibri" w:hAnsi="Calibri" w:cs="Calibri"/>
+                <w:color w:val="1A1A2E"/>
+                <w:sz w:val="17"/>
+                <w:lang w:val="es-NI"/>
+              </w:rPr>
+              <w:t>.</w:t>
+            </w:r>
+          </w:p>
+          <w:p>
+            <w:pPr>
+              <w:rPr>
+                <w:rFonts w:ascii="Calibri" w:hAnsi="Calibri" w:cs="Calibri"/>
+                <w:color w:val="1A1A2E"/>
+                <w:sz w:val="17"/>
+                <w:lang w:val="es-NI"/>
+              </w:rPr>
+            </w:pPr>
+            <w:r>
+              <w:rPr>
+                <w:rFonts w:ascii="Calibri" w:hAnsi="Calibri" w:cs="Calibri"/>
+                <w:b/>
+                <w:color w:val="0E7FD4"/>
+                <w:sz w:val="17"/>
+                <w:lang w:val="es-NI"/>
+              </w:rPr>
+              <w:t>5</w:t>
+            </w:r>
+            <w:r>
+              <w:rPr>
+                <w:rFonts w:ascii="Calibri" w:hAnsi="Calibri" w:cs="Calibri"/>
+                <w:b/>
+                <w:color w:val="0E7FD4"/>
+                <w:sz w:val="17"/>
+                <w:lang w:val="es-NI"/>
+              </w:rPr>
+              <w:t xml:space="preserve">. </w:t>
+            </w:r>
+            <w:r>
+              <w:rPr>
+                <w:rFonts w:ascii="Calibri" w:hAnsi="Calibri" w:cs="Calibri"/>
+                <w:color w:val="1A1A2E"/>
+                <w:sz w:val="17"/>
+                <w:lang w:val="es-NI"/>
+              </w:rPr>
+              <w:t>En el proceso de devolución de prima poder seleccionar a otro beneficiario para regresar el monto a una persona diferente.</w:t>
+            </w:r>
+          </w:p>
+          <w:p>
+            <w:pPr>
+              <w:rPr>
+                <w:rFonts w:ascii="Calibri" w:hAnsi="Calibri" w:cs="Calibri"/>
+                <w:color w:val="1A1A2E"/>
+                <w:sz w:val="17"/>
+                <w:lang w:val="es-NI"/>
+              </w:rPr>
+            </w:pPr>
+          </w:p>
+          <w:p>
+            <w:pPr>
+              <w:rPr>
+                <w:rFonts w:ascii="Calibri" w:hAnsi="Calibri" w:cs="Calibri"/>
+                <w:color w:val="1A1A2E"/>
+                <w:sz w:val="17"/>
+                <w:lang w:val="es-NI"/>
+              </w:rPr>
+            </w:pPr>
+          </w:p>
+          <w:p>
+            <w:pPr>
+              <w:rPr>
+                <w:lang w:val="es-NI"/>
+              </w:rPr>
+            </w:pPr>
+          </w:p>
+        </w:tc>
+      </w:tr>
+      <w:tr>
+        <w:tc>
+          <w:tcPr>
+            <w:tcW w:w="1134" w:type="dxa"/>
+          </w:tcPr>
+          <w:p>
+            <w:r>
+              <w:rPr>
+                <w:rFonts w:ascii="Calibri" w:hAnsi="Calibri" w:cs="Calibri"/>
+                <w:b/>
+                <w:color w:val="0A5C9E"/>
+                <w:sz w:val="16"/>
+              </w:rPr>
+              <w:lastRenderedPageBreak/>
+              <w:t>CA-</w:t>
+            </w:r>
+            <w:r>
+              <w:rPr>
+                <w:rFonts w:ascii="Calibri" w:hAnsi="Calibri" w:cs="Calibri"/>
+                <w:b/>
+                <w:color w:val="0A5C9E"/>
+                <w:sz w:val="16"/>
+              </w:rPr>
+              <w:t>AP1</w:t>
+            </w:r>
+            <w:r>
+              <w:rPr>
+                <w:rFonts w:ascii="Calibri" w:hAnsi="Calibri" w:cs="Calibri"/>
+                <w:b/>
+                <w:color w:val="0A5C9E"/>
+                <w:sz w:val="16"/>
+              </w:rPr>
+              <w:t>-D02</w:t>
+            </w:r>
+          </w:p>
+        </w:tc>
+        <w:tc>
+          <w:tcPr>
+            <w:tcW w:w="284" w:type="dxa"/>
+          </w:tcPr>
+          <w:p>
+            <w:pPr>
+              <w:jc w:val="center"/>
+            </w:pPr>
+            <w:r>
+              <w:rPr>
+                <w:rFonts w:ascii="Calibri" w:hAnsi="Calibri" w:cs="Calibri"/>
+                <w:b/>
+                <w:color w:val="C0392B"/>
+                <w:sz w:val="15"/>
+              </w:rPr>
+              <w:t>No Existe</w:t>
+            </w:r>
+          </w:p>
+        </w:tc>
+        <w:tc>
+          <w:tcPr>
+            <w:tcW w:w="1701" w:type="dxa"/>
+          </w:tcPr>
+          <w:p>
+            <w:pPr>
+              <w:rPr>
+                <w:lang w:val="es-NI"/>
+              </w:rPr>
+            </w:pPr>
+            <w:r>
+              <w:rPr>
+                <w:rFonts w:ascii="Calibri" w:hAnsi="Calibri" w:cs="Calibri"/>
+                <w:b/>
+                <w:color w:val="1B2B4B"/>
+                <w:sz w:val="17"/>
+                <w:lang w:val="es-NI"/>
+              </w:rPr>
+              <w:t>Depósitos a banco en negativo</w:t>
+            </w:r>
+          </w:p>
+        </w:tc>
+        <w:tc>
+          <w:tcPr>
+            <w:tcW w:w="7321" w:type="dxa"/>
+          </w:tcPr>
+          <w:p>
+            <w:pPr>
+              <w:rPr>
+                <w:rFonts w:ascii="Calibri" w:hAnsi="Calibri" w:cs="Calibri"/>
+                <w:color w:val="1A1A2E"/>
+                <w:sz w:val="17"/>
+                <w:lang w:val="es-NI"/>
+              </w:rPr>
+            </w:pPr>
+            <w:r>
+              <w:rPr>
+                <w:rFonts w:ascii="Calibri" w:hAnsi="Calibri" w:cs="Calibri"/>
+                <w:color w:val="1A1A2E"/>
+                <w:sz w:val="17"/>
+                <w:lang w:val="es-NI"/>
+              </w:rPr>
+              <w:t>Sistema debe permitir la generación de depósitos a banco con saldos negativos.</w:t>
+            </w:r>
+          </w:p>
+          <w:p>
+            <w:pPr>
+              <w:rPr>
+                <w:lang w:val="es-NI"/>
+              </w:rPr>
+            </w:pPr>
+          </w:p>
+          <w:p>
+            <w:pPr>
+              <w:pStyle w:val="Prrafodelista"/>
+              <w:numPr>
+                <w:ilvl w:val="0"/>
+                <w:numId w:val="2"/>
+              </w:numPr>
+              <w:ind w:left="176" w:hanging="176"/>
+              <w:rPr>
+                <w:rFonts w:ascii="Calibri" w:hAnsi="Calibri" w:cs="Calibri"/>
+                <w:color w:val="1A1A2E"/>
+                <w:sz w:val="17"/>
+                <w:lang w:val="es-NI"/>
+              </w:rPr>
+            </w:pPr>
+            <w:r>
+              <w:rPr>
+                <w:rFonts w:ascii="Calibri" w:hAnsi="Calibri" w:cs="Calibri"/>
+                <w:color w:val="1A1A2E"/>
+                <w:sz w:val="17"/>
+                <w:lang w:val="es-NI"/>
+              </w:rPr>
+              <w:t>Sistema debe permitir registrar un monto negativo en un depósito a banco, ya sea por la opción global o individual.</w:t>
+            </w:r>
+          </w:p>
+          <w:p>
+            <w:pPr>
+              <w:pStyle w:val="Prrafodelista"/>
+              <w:numPr>
+                <w:ilvl w:val="0"/>
+                <w:numId w:val="2"/>
+              </w:numPr>
+              <w:ind w:left="176" w:hanging="218"/>
+              <w:rPr>
+                <w:rFonts w:ascii="Calibri" w:hAnsi="Calibri" w:cs="Calibri"/>
+                <w:color w:val="1A1A2E"/>
+                <w:sz w:val="17"/>
+                <w:lang w:val="es-NI"/>
+              </w:rPr>
+            </w:pPr>
+            <w:r>
+              <w:rPr>
+                <w:rFonts w:ascii="Calibri" w:hAnsi="Calibri" w:cs="Calibri"/>
+                <w:color w:val="1A1A2E"/>
+                <w:sz w:val="17"/>
+                <w:lang w:val="es-NI"/>
+              </w:rPr>
+              <w:t>Sistema debe reconocer cuando exista un saldo negativo que el depósito debe hacerse con un monto negativo.</w:t>
+            </w:r>
+          </w:p>
+          <w:p>
+            <w:pPr>
+              <w:rPr>
+                <w:lang w:val="es-NI"/>
+              </w:rPr>
+            </w:pPr>
+          </w:p>
+        </w:tc>
+      </w:tr>
+    </w:tbl>
     <w:p>
       <w:pPr>
         <w:spacing w:before="200" w:after="80"/>
@@ -36456,11 +36767,105 @@
       </w:pPr>
     </w:lvl>
   </w:abstractNum>
+  <w:abstractNum w:abstractNumId="1" w15:restartNumberingAfterBreak="0">
+    <w:nsid w:val="783275C9"/>
+    <w:multiLevelType w:val="hybridMultilevel"/>
+    <w:tmpl w:val="1CAAE666"/>
+    <w:lvl w:ilvl="0" w:tplc="B21663E0">
+      <w:start w:val="1"/>
+      <w:numFmt w:val="decimal"/>
+      <w:lvlText w:val="%1."/>
+      <w:lvlJc w:val="left"/>
+      <w:pPr>
+        <w:ind w:left="720" w:hanging="360"/>
+      </w:pPr>
+      <w:rPr>
+        <w:rFonts w:hint="default"/>
+        <w:b/>
+        <w:color w:val="0E7FD4"/>
+      </w:rPr>
+    </w:lvl>
+    <w:lvl w:ilvl="1" w:tplc="4C0A0019" w:tentative="1">
+      <w:start w:val="1"/>
+      <w:numFmt w:val="lowerLetter"/>
+      <w:lvlText w:val="%2."/>
+      <w:lvlJc w:val="left"/>
+      <w:pPr>
+        <w:ind w:left="1440" w:hanging="360"/>
+      </w:pPr>
+    </w:lvl>
+    <w:lvl w:ilvl="2" w:tplc="4C0A001B" w:tentative="1">
+      <w:start w:val="1"/>
+      <w:numFmt w:val="lowerRoman"/>
+      <w:lvlText w:val="%3."/>
+      <w:lvlJc w:val="right"/>
+      <w:pPr>
+        <w:ind w:left="2160" w:hanging="180"/>
+      </w:pPr>
+    </w:lvl>
+    <w:lvl w:ilvl="3" w:tplc="4C0A000F" w:tentative="1">
+      <w:start w:val="1"/>
+      <w:numFmt w:val="decimal"/>
+      <w:lvlText w:val="%4."/>
+      <w:lvlJc w:val="left"/>
+      <w:pPr>
+        <w:ind w:left="2880" w:hanging="360"/>
+      </w:pPr>
+    </w:lvl>
+    <w:lvl w:ilvl="4" w:tplc="4C0A0019" w:tentative="1">
+      <w:start w:val="1"/>
+      <w:numFmt w:val="lowerLetter"/>
+      <w:lvlText w:val="%5."/>
+      <w:lvlJc w:val="left"/>
+      <w:pPr>
+        <w:ind w:left="3600" w:hanging="360"/>
+      </w:pPr>
+    </w:lvl>
+    <w:lvl w:ilvl="5" w:tplc="4C0A001B" w:tentative="1">
+      <w:start w:val="1"/>
+      <w:numFmt w:val="lowerRoman"/>
+      <w:lvlText w:val="%6."/>
+      <w:lvlJc w:val="right"/>
+      <w:pPr>
+        <w:ind w:left="4320" w:hanging="180"/>
+      </w:pPr>
+    </w:lvl>
+    <w:lvl w:ilvl="6" w:tplc="4C0A000F" w:tentative="1">
+      <w:start w:val="1"/>
+      <w:numFmt w:val="decimal"/>
+      <w:lvlText w:val="%7."/>
+      <w:lvlJc w:val="left"/>
+      <w:pPr>
+        <w:ind w:left="5040" w:hanging="360"/>
+      </w:pPr>
+    </w:lvl>
+    <w:lvl w:ilvl="7" w:tplc="4C0A0019" w:tentative="1">
+      <w:start w:val="1"/>
+      <w:numFmt w:val="lowerLetter"/>
+      <w:lvlText w:val="%8."/>
+      <w:lvlJc w:val="left"/>
+      <w:pPr>
+        <w:ind w:left="5760" w:hanging="360"/>
+      </w:pPr>
+    </w:lvl>
+    <w:lvl w:ilvl="8" w:tplc="4C0A001B" w:tentative="1">
+      <w:start w:val="1"/>
+      <w:numFmt w:val="lowerRoman"/>
+      <w:lvlText w:val="%9."/>
+      <w:lvlJc w:val="right"/>
+      <w:pPr>
+        <w:ind w:left="6480" w:hanging="180"/>
+      </w:pPr>
+    </w:lvl>
+  </w:abstractNum>
   <w:num w:numId="1" w16cid:durableId="1730305554">
     <w:abstractNumId w:val="0"/>
     <w:lvlOverride w:ilvl="0">
       <w:startOverride w:val="1"/>
     </w:lvlOverride>
+  </w:num>
+  <w:num w:numId="2" w16cid:durableId="247468144">
+    <w:abstractNumId w:val="1"/>
   </w:num>
 </w:numbering>
 </file>

</xml_diff>